<commit_message>
assessment-task 1a to 1e
</commit_message>
<xml_diff>
--- a/Assessment/CSE3001_Assignment_Report.docx
+++ b/Assessment/CSE3001_Assignment_Report.docx
@@ -165,14 +165,55 @@
           <w:p>
             <w:pPr>
               <w:spacing w:after="200"/>
-            </w:pPr>
-            <w:r>
-              <w:rPr>
-                <w:i/>
-                <w:iCs/>
-                <w:color w:val="666666"/>
-              </w:rPr>
-              <w:t>Insert your answer here</w:t>
+              <w:rPr>
+                <w:i/>
+                <w:iCs/>
+                <w:color w:val="666666"/>
+              </w:rPr>
+            </w:pPr>
+            <w:r>
+              <w:rPr>
+                <w:i/>
+                <w:iCs/>
+                <w:color w:val="666666"/>
+              </w:rPr>
+              <w:t>I checked two potential data issues: the class distribution across the seven lesion categories, and the integrity of the image files (whether every referenced image exists and whether all images share a consistent resolution).</w:t>
+            </w:r>
+          </w:p>
+          <w:p>
+            <w:pPr>
+              <w:spacing w:after="200"/>
+              <w:rPr>
+                <w:i/>
+                <w:iCs/>
+                <w:color w:val="666666"/>
+              </w:rPr>
+            </w:pPr>
+            <w:r>
+              <w:rPr>
+                <w:i/>
+                <w:iCs/>
+                <w:color w:val="666666"/>
+              </w:rPr>
+              <w:t>I checked the class distribution because skin-lesion datasets are commonly imbalanced, and imbalance has direct consequences for both training and evaluation. If one class dominates, a model can achieve a high overall accuracy simply by predicting the majority class, while performing poorly on the clinically important rare classes. Knowing the distribution in advance lets me anticipate this and justifies using a balanced metric (UAR) alongside accuracy, as well as later imbalance-handling strategies.</w:t>
+            </w:r>
+          </w:p>
+          <w:p>
+            <w:pPr>
+              <w:spacing w:after="200"/>
+              <w:rPr>
+                <w:i/>
+                <w:iCs/>
+                <w:color w:val="666666"/>
+              </w:rPr>
+            </w:pPr>
+            <w:r>
+              <w:rPr>
+                <w:i/>
+                <w:iCs/>
+                <w:color w:val="666666"/>
+              </w:rPr>
+              <w:t>I checked image integrity — specifically missing files and size consistency — because the pipeline loads each image lazily from disk by its filename. A missing file would cause a runtime error mid-training, and inconsistent image dimensions would mean a fixed resizing transform behaves differently across samples. Verifying these properties up front confirms the dataset is structurally sound and that a single common resize transform can be applied safely to every image.</w:t>
             </w:r>
           </w:p>
           <w:p>
@@ -188,13 +229,96 @@
             </w:r>
           </w:p>
           <w:p>
-            <w:r>
-              <w:rPr>
-                <w:i/>
-                <w:iCs/>
-                <w:color w:val="666666"/>
-              </w:rPr>
-              <w:t>Insert your answer here</w:t>
+            <w:pPr>
+              <w:rPr>
+                <w:i/>
+                <w:iCs/>
+                <w:color w:val="666666"/>
+              </w:rPr>
+            </w:pPr>
+            <w:r>
+              <w:rPr>
+                <w:i/>
+                <w:iCs/>
+                <w:color w:val="666666"/>
+              </w:rPr>
+              <w:t>The dataset is heavily imbalanced, and the imbalance is consistent across both the training and validation splits.</w:t>
+            </w:r>
+            <w:r>
+              <w:rPr>
+                <w:i/>
+                <w:iCs/>
+                <w:color w:val="666666"/>
+              </w:rPr>
+              <w:br/>
+            </w:r>
+          </w:p>
+          <w:p>
+            <w:pPr>
+              <w:rPr>
+                <w:i/>
+                <w:iCs/>
+                <w:color w:val="666666"/>
+              </w:rPr>
+            </w:pPr>
+            <w:r>
+              <w:rPr>
+                <w:i/>
+                <w:iCs/>
+                <w:color w:val="666666"/>
+              </w:rPr>
+              <w:t>In the training set (3,004 images), the Melanocytic Nevus (NV) class dominates with 2,052 images (68.3% of the data), while the remaining six classes are far smaller: BKL 339, MEL 267, BCC 151, AKIEC 114, VASC 45, and DF 36. The rarest class (DF) is therefore roughly 57× smaller than NV. The validation set (400 images) shows the same skew — NV 281 (~70%), BKL 38, MEL 32, BCC 21, AKIEC 18, VASC 5, and DF 5.</w:t>
+            </w:r>
+            <w:r>
+              <w:rPr>
+                <w:i/>
+                <w:iCs/>
+                <w:color w:val="666666"/>
+              </w:rPr>
+              <w:br/>
+            </w:r>
+          </w:p>
+          <w:p>
+            <w:pPr>
+              <w:rPr>
+                <w:i/>
+                <w:iCs/>
+                <w:color w:val="666666"/>
+              </w:rPr>
+            </w:pPr>
+            <w:r>
+              <w:rPr>
+                <w:i/>
+                <w:iCs/>
+                <w:color w:val="666666"/>
+              </w:rPr>
+              <w:lastRenderedPageBreak/>
+              <w:t>This dominance of NV means overall accuracy will be a misleading measure of performance: a model could reach close to 68% accuracy simply by always predicting NV, while failing on under-represented classes such as DF and VASC. This finding motivates the use of unweighted average recall (UAR) as a fairer metric and the imbalance-handling strategies applied in a later task (e.g., a weighted sampler or a class-weighted loss).</w:t>
+            </w:r>
+            <w:r>
+              <w:rPr>
+                <w:i/>
+                <w:iCs/>
+                <w:color w:val="666666"/>
+              </w:rPr>
+              <w:br/>
+            </w:r>
+          </w:p>
+          <w:p>
+            <w:pPr>
+              <w:rPr>
+                <w:i/>
+                <w:iCs/>
+                <w:color w:val="666666"/>
+              </w:rPr>
+            </w:pPr>
+            <w:r>
+              <w:rPr>
+                <w:i/>
+                <w:iCs/>
+                <w:color w:val="666666"/>
+              </w:rPr>
+              <w:t>The image-integrity check returned a clean result: 0 missing files — every image referenced in train.csv was present — and all 3,004 training images had an identical resolution of 600 × 450 pixels. The dataset is therefore structurally consistent on these dimensions, which supports applying a single common resize transform to all images in the data-loading pipeline.</w:t>
             </w:r>
           </w:p>
         </w:tc>
@@ -296,13 +420,72 @@
             </w:r>
           </w:p>
           <w:p>
-            <w:r>
-              <w:rPr>
-                <w:i/>
-                <w:iCs/>
-                <w:color w:val="666666"/>
-              </w:rPr>
-              <w:t>Insert your answer here</w:t>
+            <w:pPr>
+              <w:rPr>
+                <w:i/>
+                <w:iCs/>
+                <w:color w:val="666666"/>
+              </w:rPr>
+            </w:pPr>
+            <w:r>
+              <w:rPr>
+                <w:i/>
+                <w:iCs/>
+                <w:color w:val="666666"/>
+              </w:rPr>
+              <w:t>The random_split function was not used because the training and validation splits are pre-defined by the assignment as separate files (train.csv and val.csv). Using these fixed splits serves two important purposes.</w:t>
+            </w:r>
+          </w:p>
+          <w:p>
+            <w:pPr>
+              <w:rPr>
+                <w:i/>
+                <w:iCs/>
+                <w:color w:val="666666"/>
+              </w:rPr>
+            </w:pPr>
+          </w:p>
+          <w:p>
+            <w:pPr>
+              <w:rPr>
+                <w:i/>
+                <w:iCs/>
+                <w:color w:val="666666"/>
+              </w:rPr>
+            </w:pPr>
+            <w:r>
+              <w:rPr>
+                <w:i/>
+                <w:iCs/>
+                <w:color w:val="666666"/>
+              </w:rPr>
+              <w:t>First, it ensures comparability and fairness across students. Because every student trains on the same training data and evaluates on the same held-out validation set, reported metrics (accuracy, UAR, confusion matrices) are directly comparable and reflect genuine differences in model design rather than differences in how the data happened to be partitioned. If each student called random_split, every student would effectively be evaluating on a different validation set, so results could not be meaningfully compared or reproduced.</w:t>
+            </w:r>
+          </w:p>
+          <w:p>
+            <w:pPr>
+              <w:rPr>
+                <w:i/>
+                <w:iCs/>
+                <w:color w:val="666666"/>
+              </w:rPr>
+            </w:pPr>
+          </w:p>
+          <w:p>
+            <w:pPr>
+              <w:rPr>
+                <w:i/>
+                <w:iCs/>
+                <w:color w:val="666666"/>
+              </w:rPr>
+            </w:pPr>
+            <w:r>
+              <w:rPr>
+                <w:i/>
+                <w:iCs/>
+                <w:color w:val="666666"/>
+              </w:rPr>
+              <w:t>Second, the dataset is severely class-imbalanced (NV ≈ 68% of training data, while DF has only 36 and VASC only 45 examples). An unstratified random_split could, by chance, allocate very few — or even zero — examples of a rare class to the validation set. This would make the validation metrics for those classes unstable or undefined, and the per-class recall used in UAR would no longer be a reliable estimate. A carefully constructed, fixed split avoids this by guaranteeing every class is represented in validation. Using the provided splits also makes runs reproducible, since the partition does not depend on a random seed.</w:t>
             </w:r>
           </w:p>
         </w:tc>
@@ -379,13 +562,46 @@
             </w:r>
           </w:p>
           <w:p>
-            <w:r>
-              <w:rPr>
-                <w:i/>
-                <w:iCs/>
-                <w:color w:val="666666"/>
-              </w:rPr>
-              <w:t>Insert your answer here</w:t>
+            <w:pPr>
+              <w:rPr>
+                <w:i/>
+                <w:iCs/>
+                <w:color w:val="666666"/>
+              </w:rPr>
+            </w:pPr>
+            <w:r>
+              <w:rPr>
+                <w:i/>
+                <w:iCs/>
+                <w:color w:val="666666"/>
+              </w:rPr>
+              <w:t>The training loop can be restricted to a single batch by iterating over the DataLoader with enumerate(loader) and breaking out of the loop after the first iteration — for example, by checking if i == 0: break once the batch has been processed. In the current train_epoch implementation, the loop already has the form for i, (inputs, lbls) in enumerate(loader):, so adding the break after the optimizer.step() would run exactly one forward pass, one loss computation, one backward pass, and one weight update before stopping. The same technique can be applied to val_epoch to run a single validation batch. (In practice this is usually controlled by a small debug flag so it can be toggled without permanently editing the loop.)</w:t>
+            </w:r>
+          </w:p>
+          <w:p>
+            <w:pPr>
+              <w:rPr>
+                <w:i/>
+                <w:iCs/>
+                <w:color w:val="666666"/>
+              </w:rPr>
+            </w:pPr>
+          </w:p>
+          <w:p>
+            <w:pPr>
+              <w:rPr>
+                <w:i/>
+                <w:iCs/>
+                <w:color w:val="666666"/>
+              </w:rPr>
+            </w:pPr>
+            <w:r>
+              <w:rPr>
+                <w:i/>
+                <w:iCs/>
+                <w:color w:val="666666"/>
+              </w:rPr>
+              <w:t>This single-batch strategy is valuable for fast, early debugging. A full epoch over the dataset is expensive, so it is wasteful to wait for one to complete only to discover a crash. Running just one batch exercises the entire pipeline end-to-end — data loading, tensor shapes, dtypes, device placement (CPU vs. GPU), the loss computation, and the backward pass — so errors such as shape mismatches, wrong label types for CrossEntropyLoss, or CPU/CUDA device mismatches surface within seconds rather than minutes. Once the loop is confirmed to run correctly on a single batch, it can be allowed to run over full epochs with confidence.</w:t>
             </w:r>
           </w:p>
         </w:tc>
@@ -468,75 +684,676 @@
           <w:p>
             <w:pPr>
               <w:spacing w:after="80"/>
-            </w:pPr>
-            <w:r>
               <w:rPr>
                 <w:b/>
                 <w:bCs/>
               </w:rPr>
-              <w:lastRenderedPageBreak/>
-              <w:t>Evidence:</w:t>
-            </w:r>
-          </w:p>
-          <w:p>
-            <w:pPr>
-              <w:spacing w:after="200"/>
-              <w:rPr>
-                <w:i/>
-                <w:iCs/>
-                <w:color w:val="666666"/>
-              </w:rPr>
-            </w:pPr>
-            <w:r>
-              <w:rPr>
-                <w:i/>
-                <w:iCs/>
-                <w:color w:val="666666"/>
-              </w:rPr>
-              <w:t>Insert Confusion Matrix Plot Here</w:t>
-            </w:r>
-          </w:p>
-          <w:p>
-            <w:pPr>
-              <w:spacing w:after="200"/>
-              <w:rPr>
-                <w:i/>
-                <w:iCs/>
-                <w:color w:val="666666"/>
-              </w:rPr>
-            </w:pPr>
-            <w:r>
-              <w:rPr>
-                <w:i/>
-                <w:iCs/>
-                <w:color w:val="666666"/>
-              </w:rPr>
-              <w:t>Insert table with results from other metrics here</w:t>
-            </w:r>
-          </w:p>
-          <w:p>
-            <w:pPr>
-              <w:spacing w:after="80"/>
             </w:pPr>
             <w:r>
               <w:rPr>
                 <w:b/>
                 <w:bCs/>
               </w:rPr>
+              <w:t>Evidence:</w:t>
+            </w:r>
+          </w:p>
+          <w:p>
+            <w:pPr>
+              <w:spacing w:after="80"/>
+            </w:pPr>
+          </w:p>
+          <w:p>
+            <w:pPr>
+              <w:spacing w:after="200"/>
+              <w:jc w:val="center"/>
+              <w:rPr>
+                <w:i/>
+                <w:iCs/>
+                <w:color w:val="666666"/>
+              </w:rPr>
+            </w:pPr>
+            <w:r>
+              <w:rPr>
+                <w:i/>
+                <w:iCs/>
+                <w:noProof/>
+                <w:color w:val="666666"/>
+              </w:rPr>
+              <w:drawing>
+                <wp:inline distT="0" distB="0" distL="0" distR="0" wp14:anchorId="10CD1433" wp14:editId="0A97C460">
+                  <wp:extent cx="4907705" cy="3970364"/>
+                  <wp:effectExtent l="0" t="0" r="7620" b="0"/>
+                  <wp:docPr id="1996860372" name="Picture 2"/>
+                  <wp:cNvGraphicFramePr>
+                    <a:graphicFrameLocks xmlns:a="http://schemas.openxmlformats.org/drawingml/2006/main" noChangeAspect="1"/>
+                  </wp:cNvGraphicFramePr>
+                  <a:graphic xmlns:a="http://schemas.openxmlformats.org/drawingml/2006/main">
+                    <a:graphicData uri="http://schemas.openxmlformats.org/drawingml/2006/picture">
+                      <pic:pic xmlns:pic="http://schemas.openxmlformats.org/drawingml/2006/picture">
+                        <pic:nvPicPr>
+                          <pic:cNvPr id="1996860372" name="Picture 1996860372"/>
+                          <pic:cNvPicPr/>
+                        </pic:nvPicPr>
+                        <pic:blipFill>
+                          <a:blip r:embed="rId5">
+                            <a:extLst>
+                              <a:ext uri="{28A0092B-C50C-407E-A947-70E740481C1C}">
+                                <a14:useLocalDpi xmlns:a14="http://schemas.microsoft.com/office/drawing/2010/main" val="0"/>
+                              </a:ext>
+                            </a:extLst>
+                          </a:blip>
+                          <a:stretch>
+                            <a:fillRect/>
+                          </a:stretch>
+                        </pic:blipFill>
+                        <pic:spPr>
+                          <a:xfrm>
+                            <a:off x="0" y="0"/>
+                            <a:ext cx="4907705" cy="3970364"/>
+                          </a:xfrm>
+                          <a:prstGeom prst="rect">
+                            <a:avLst/>
+                          </a:prstGeom>
+                        </pic:spPr>
+                      </pic:pic>
+                    </a:graphicData>
+                  </a:graphic>
+                </wp:inline>
+              </w:drawing>
+            </w:r>
+          </w:p>
+          <w:p>
+            <w:pPr>
+              <w:spacing w:after="200"/>
+              <w:rPr>
+                <w:i/>
+                <w:iCs/>
+                <w:color w:val="666666"/>
+              </w:rPr>
+            </w:pPr>
+          </w:p>
+          <w:p>
+            <w:pPr>
+              <w:spacing w:after="200"/>
+              <w:rPr>
+                <w:i/>
+                <w:iCs/>
+                <w:color w:val="666666"/>
+              </w:rPr>
+            </w:pPr>
+            <w:r>
+              <w:rPr>
+                <w:i/>
+                <w:iCs/>
+                <w:color w:val="666666"/>
+              </w:rPr>
+              <w:t xml:space="preserve">Metrics Table: </w:t>
+            </w:r>
+          </w:p>
+          <w:tbl>
+            <w:tblPr>
+              <w:tblStyle w:val="TableGrid"/>
+              <w:tblW w:w="0" w:type="auto"/>
+              <w:jc w:val="center"/>
+              <w:tblLook w:val="04A0" w:firstRow="1" w:lastRow="0" w:firstColumn="1" w:lastColumn="0" w:noHBand="0" w:noVBand="1"/>
+            </w:tblPr>
+            <w:tblGrid>
+              <w:gridCol w:w="2149"/>
+              <w:gridCol w:w="889"/>
+            </w:tblGrid>
+            <w:tr>
+              <w:trPr>
+                <w:jc w:val="center"/>
+              </w:trPr>
+              <w:tc>
+                <w:tcPr>
+                  <w:tcW w:w="0" w:type="auto"/>
+                  <w:hideMark/>
+                </w:tcPr>
+                <w:p>
+                  <w:pPr>
+                    <w:jc w:val="center"/>
+                    <w:rPr>
+                      <w:rFonts w:eastAsia="Times New Roman"/>
+                      <w:b/>
+                      <w:bCs/>
+                      <w:lang w:bidi="bn-BD"/>
+                    </w:rPr>
+                  </w:pPr>
+                  <w:r>
+                    <w:rPr>
+                      <w:rFonts w:eastAsia="Times New Roman"/>
+                      <w:b/>
+                      <w:bCs/>
+                      <w:lang w:bidi="bn-BD"/>
+                    </w:rPr>
+                    <w:t>Metric</w:t>
+                  </w:r>
+                </w:p>
+              </w:tc>
+              <w:tc>
+                <w:tcPr>
+                  <w:tcW w:w="0" w:type="auto"/>
+                  <w:hideMark/>
+                </w:tcPr>
+                <w:p>
+                  <w:pPr>
+                    <w:jc w:val="center"/>
+                    <w:rPr>
+                      <w:rFonts w:eastAsia="Times New Roman"/>
+                      <w:b/>
+                      <w:bCs/>
+                      <w:lang w:bidi="bn-BD"/>
+                    </w:rPr>
+                  </w:pPr>
+                  <w:r>
+                    <w:rPr>
+                      <w:rFonts w:eastAsia="Times New Roman"/>
+                      <w:b/>
+                      <w:bCs/>
+                      <w:lang w:bidi="bn-BD"/>
+                    </w:rPr>
+                    <w:t>Value</w:t>
+                  </w:r>
+                </w:p>
+              </w:tc>
+            </w:tr>
+            <w:tr>
+              <w:trPr>
+                <w:jc w:val="center"/>
+              </w:trPr>
+              <w:tc>
+                <w:tcPr>
+                  <w:tcW w:w="0" w:type="auto"/>
+                  <w:hideMark/>
+                </w:tcPr>
+                <w:p>
+                  <w:pPr>
+                    <w:rPr>
+                      <w:rFonts w:eastAsia="Times New Roman"/>
+                      <w:lang w:bidi="bn-BD"/>
+                    </w:rPr>
+                  </w:pPr>
+                  <w:r>
+                    <w:rPr>
+                      <w:rFonts w:eastAsia="Times New Roman"/>
+                      <w:lang w:bidi="bn-BD"/>
+                    </w:rPr>
+                    <w:t>Validation Accuracy</w:t>
+                  </w:r>
+                </w:p>
+              </w:tc>
+              <w:tc>
+                <w:tcPr>
+                  <w:tcW w:w="0" w:type="auto"/>
+                  <w:hideMark/>
+                </w:tcPr>
+                <w:p>
+                  <w:pPr>
+                    <w:rPr>
+                      <w:rFonts w:eastAsia="Times New Roman"/>
+                      <w:lang w:bidi="bn-BD"/>
+                    </w:rPr>
+                  </w:pPr>
+                  <w:r>
+                    <w:rPr>
+                      <w:rFonts w:eastAsia="Times New Roman"/>
+                      <w:lang w:bidi="bn-BD"/>
+                    </w:rPr>
+                    <w:t>0.7325</w:t>
+                  </w:r>
+                </w:p>
+              </w:tc>
+            </w:tr>
+            <w:tr>
+              <w:trPr>
+                <w:jc w:val="center"/>
+              </w:trPr>
+              <w:tc>
+                <w:tcPr>
+                  <w:tcW w:w="0" w:type="auto"/>
+                  <w:hideMark/>
+                </w:tcPr>
+                <w:p>
+                  <w:pPr>
+                    <w:rPr>
+                      <w:rFonts w:eastAsia="Times New Roman"/>
+                      <w:lang w:bidi="bn-BD"/>
+                    </w:rPr>
+                  </w:pPr>
+                  <w:r>
+                    <w:rPr>
+                      <w:rFonts w:eastAsia="Times New Roman"/>
+                      <w:lang w:bidi="bn-BD"/>
+                    </w:rPr>
+                    <w:t>Validation UAR</w:t>
+                  </w:r>
+                </w:p>
+              </w:tc>
+              <w:tc>
+                <w:tcPr>
+                  <w:tcW w:w="0" w:type="auto"/>
+                  <w:hideMark/>
+                </w:tcPr>
+                <w:p>
+                  <w:pPr>
+                    <w:rPr>
+                      <w:rFonts w:eastAsia="Times New Roman"/>
+                      <w:lang w:bidi="bn-BD"/>
+                    </w:rPr>
+                  </w:pPr>
+                  <w:r>
+                    <w:rPr>
+                      <w:rFonts w:eastAsia="Times New Roman"/>
+                      <w:lang w:bidi="bn-BD"/>
+                    </w:rPr>
+                    <w:t>0.3878</w:t>
+                  </w:r>
+                </w:p>
+              </w:tc>
+            </w:tr>
+            <w:tr>
+              <w:trPr>
+                <w:jc w:val="center"/>
+              </w:trPr>
+              <w:tc>
+                <w:tcPr>
+                  <w:tcW w:w="0" w:type="auto"/>
+                  <w:hideMark/>
+                </w:tcPr>
+                <w:p>
+                  <w:pPr>
+                    <w:rPr>
+                      <w:rFonts w:eastAsia="Times New Roman"/>
+                      <w:lang w:bidi="bn-BD"/>
+                    </w:rPr>
+                  </w:pPr>
+                  <w:r>
+                    <w:rPr>
+                      <w:rFonts w:eastAsia="Times New Roman"/>
+                      <w:lang w:bidi="bn-BD"/>
+                    </w:rPr>
+                    <w:t>MEL Recall</w:t>
+                  </w:r>
+                </w:p>
+              </w:tc>
+              <w:tc>
+                <w:tcPr>
+                  <w:tcW w:w="0" w:type="auto"/>
+                  <w:hideMark/>
+                </w:tcPr>
+                <w:p>
+                  <w:pPr>
+                    <w:rPr>
+                      <w:rFonts w:eastAsia="Times New Roman"/>
+                      <w:lang w:bidi="bn-BD"/>
+                    </w:rPr>
+                  </w:pPr>
+                  <w:r>
+                    <w:rPr>
+                      <w:rFonts w:eastAsia="Times New Roman"/>
+                      <w:lang w:bidi="bn-BD"/>
+                    </w:rPr>
+                    <w:t>0.4062</w:t>
+                  </w:r>
+                </w:p>
+              </w:tc>
+            </w:tr>
+            <w:tr>
+              <w:trPr>
+                <w:jc w:val="center"/>
+              </w:trPr>
+              <w:tc>
+                <w:tcPr>
+                  <w:tcW w:w="0" w:type="auto"/>
+                  <w:hideMark/>
+                </w:tcPr>
+                <w:p>
+                  <w:pPr>
+                    <w:rPr>
+                      <w:rFonts w:eastAsia="Times New Roman"/>
+                      <w:lang w:bidi="bn-BD"/>
+                    </w:rPr>
+                  </w:pPr>
+                  <w:r>
+                    <w:rPr>
+                      <w:rFonts w:eastAsia="Times New Roman"/>
+                      <w:lang w:bidi="bn-BD"/>
+                    </w:rPr>
+                    <w:t>NV Recall</w:t>
+                  </w:r>
+                </w:p>
+              </w:tc>
+              <w:tc>
+                <w:tcPr>
+                  <w:tcW w:w="0" w:type="auto"/>
+                  <w:hideMark/>
+                </w:tcPr>
+                <w:p>
+                  <w:pPr>
+                    <w:rPr>
+                      <w:rFonts w:eastAsia="Times New Roman"/>
+                      <w:lang w:bidi="bn-BD"/>
+                    </w:rPr>
+                  </w:pPr>
+                  <w:r>
+                    <w:rPr>
+                      <w:rFonts w:eastAsia="Times New Roman"/>
+                      <w:lang w:bidi="bn-BD"/>
+                    </w:rPr>
+                    <w:t>0.8754</w:t>
+                  </w:r>
+                </w:p>
+              </w:tc>
+            </w:tr>
+            <w:tr>
+              <w:trPr>
+                <w:jc w:val="center"/>
+              </w:trPr>
+              <w:tc>
+                <w:tcPr>
+                  <w:tcW w:w="0" w:type="auto"/>
+                  <w:hideMark/>
+                </w:tcPr>
+                <w:p>
+                  <w:pPr>
+                    <w:rPr>
+                      <w:rFonts w:eastAsia="Times New Roman"/>
+                      <w:lang w:bidi="bn-BD"/>
+                    </w:rPr>
+                  </w:pPr>
+                  <w:r>
+                    <w:rPr>
+                      <w:rFonts w:eastAsia="Times New Roman"/>
+                      <w:lang w:bidi="bn-BD"/>
+                    </w:rPr>
+                    <w:t>BCC Recall</w:t>
+                  </w:r>
+                </w:p>
+              </w:tc>
+              <w:tc>
+                <w:tcPr>
+                  <w:tcW w:w="0" w:type="auto"/>
+                  <w:hideMark/>
+                </w:tcPr>
+                <w:p>
+                  <w:pPr>
+                    <w:rPr>
+                      <w:rFonts w:eastAsia="Times New Roman"/>
+                      <w:lang w:bidi="bn-BD"/>
+                    </w:rPr>
+                  </w:pPr>
+                  <w:r>
+                    <w:rPr>
+                      <w:rFonts w:eastAsia="Times New Roman"/>
+                      <w:lang w:bidi="bn-BD"/>
+                    </w:rPr>
+                    <w:t>0.6190</w:t>
+                  </w:r>
+                </w:p>
+              </w:tc>
+            </w:tr>
+            <w:tr>
+              <w:trPr>
+                <w:jc w:val="center"/>
+              </w:trPr>
+              <w:tc>
+                <w:tcPr>
+                  <w:tcW w:w="0" w:type="auto"/>
+                  <w:hideMark/>
+                </w:tcPr>
+                <w:p>
+                  <w:pPr>
+                    <w:rPr>
+                      <w:rFonts w:eastAsia="Times New Roman"/>
+                      <w:lang w:bidi="bn-BD"/>
+                    </w:rPr>
+                  </w:pPr>
+                  <w:r>
+                    <w:rPr>
+                      <w:rFonts w:eastAsia="Times New Roman"/>
+                      <w:lang w:bidi="bn-BD"/>
+                    </w:rPr>
+                    <w:t>AKIEC Recall</w:t>
+                  </w:r>
+                </w:p>
+              </w:tc>
+              <w:tc>
+                <w:tcPr>
+                  <w:tcW w:w="0" w:type="auto"/>
+                  <w:hideMark/>
+                </w:tcPr>
+                <w:p>
+                  <w:pPr>
+                    <w:rPr>
+                      <w:rFonts w:eastAsia="Times New Roman"/>
+                      <w:lang w:bidi="bn-BD"/>
+                    </w:rPr>
+                  </w:pPr>
+                  <w:r>
+                    <w:rPr>
+                      <w:rFonts w:eastAsia="Times New Roman"/>
+                      <w:lang w:bidi="bn-BD"/>
+                    </w:rPr>
+                    <w:t>0.1667</w:t>
+                  </w:r>
+                </w:p>
+              </w:tc>
+            </w:tr>
+            <w:tr>
+              <w:trPr>
+                <w:jc w:val="center"/>
+              </w:trPr>
+              <w:tc>
+                <w:tcPr>
+                  <w:tcW w:w="0" w:type="auto"/>
+                  <w:hideMark/>
+                </w:tcPr>
+                <w:p>
+                  <w:pPr>
+                    <w:rPr>
+                      <w:rFonts w:eastAsia="Times New Roman"/>
+                      <w:lang w:bidi="bn-BD"/>
+                    </w:rPr>
+                  </w:pPr>
+                  <w:r>
+                    <w:rPr>
+                      <w:rFonts w:eastAsia="Times New Roman"/>
+                      <w:lang w:bidi="bn-BD"/>
+                    </w:rPr>
+                    <w:t>BKL Recall</w:t>
+                  </w:r>
+                </w:p>
+              </w:tc>
+              <w:tc>
+                <w:tcPr>
+                  <w:tcW w:w="0" w:type="auto"/>
+                  <w:hideMark/>
+                </w:tcPr>
+                <w:p>
+                  <w:pPr>
+                    <w:rPr>
+                      <w:rFonts w:eastAsia="Times New Roman"/>
+                      <w:lang w:bidi="bn-BD"/>
+                    </w:rPr>
+                  </w:pPr>
+                  <w:r>
+                    <w:rPr>
+                      <w:rFonts w:eastAsia="Times New Roman"/>
+                      <w:lang w:bidi="bn-BD"/>
+                    </w:rPr>
+                    <w:t>0.4474</w:t>
+                  </w:r>
+                </w:p>
+              </w:tc>
+            </w:tr>
+            <w:tr>
+              <w:trPr>
+                <w:jc w:val="center"/>
+              </w:trPr>
+              <w:tc>
+                <w:tcPr>
+                  <w:tcW w:w="0" w:type="auto"/>
+                  <w:hideMark/>
+                </w:tcPr>
+                <w:p>
+                  <w:pPr>
+                    <w:rPr>
+                      <w:rFonts w:eastAsia="Times New Roman"/>
+                      <w:lang w:bidi="bn-BD"/>
+                    </w:rPr>
+                  </w:pPr>
+                  <w:r>
+                    <w:rPr>
+                      <w:rFonts w:eastAsia="Times New Roman"/>
+                      <w:lang w:bidi="bn-BD"/>
+                    </w:rPr>
+                    <w:t>DF Recall</w:t>
+                  </w:r>
+                </w:p>
+              </w:tc>
+              <w:tc>
+                <w:tcPr>
+                  <w:tcW w:w="0" w:type="auto"/>
+                  <w:hideMark/>
+                </w:tcPr>
+                <w:p>
+                  <w:pPr>
+                    <w:rPr>
+                      <w:rFonts w:eastAsia="Times New Roman"/>
+                      <w:lang w:bidi="bn-BD"/>
+                    </w:rPr>
+                  </w:pPr>
+                  <w:r>
+                    <w:rPr>
+                      <w:rFonts w:eastAsia="Times New Roman"/>
+                      <w:lang w:bidi="bn-BD"/>
+                    </w:rPr>
+                    <w:t>0.0000</w:t>
+                  </w:r>
+                </w:p>
+              </w:tc>
+            </w:tr>
+            <w:tr>
+              <w:trPr>
+                <w:jc w:val="center"/>
+              </w:trPr>
+              <w:tc>
+                <w:tcPr>
+                  <w:tcW w:w="0" w:type="auto"/>
+                  <w:hideMark/>
+                </w:tcPr>
+                <w:p>
+                  <w:pPr>
+                    <w:rPr>
+                      <w:rFonts w:eastAsia="Times New Roman"/>
+                      <w:lang w:bidi="bn-BD"/>
+                    </w:rPr>
+                  </w:pPr>
+                  <w:r>
+                    <w:rPr>
+                      <w:rFonts w:eastAsia="Times New Roman"/>
+                      <w:lang w:bidi="bn-BD"/>
+                    </w:rPr>
+                    <w:t>VASC Recall</w:t>
+                  </w:r>
+                </w:p>
+              </w:tc>
+              <w:tc>
+                <w:tcPr>
+                  <w:tcW w:w="0" w:type="auto"/>
+                  <w:hideMark/>
+                </w:tcPr>
+                <w:p>
+                  <w:pPr>
+                    <w:rPr>
+                      <w:rFonts w:eastAsia="Times New Roman"/>
+                      <w:lang w:bidi="bn-BD"/>
+                    </w:rPr>
+                  </w:pPr>
+                  <w:r>
+                    <w:rPr>
+                      <w:rFonts w:eastAsia="Times New Roman"/>
+                      <w:lang w:bidi="bn-BD"/>
+                    </w:rPr>
+                    <w:t>0.2000</w:t>
+                  </w:r>
+                </w:p>
+              </w:tc>
+            </w:tr>
+          </w:tbl>
+          <w:p>
+            <w:pPr>
+              <w:spacing w:after="200"/>
+              <w:rPr>
+                <w:color w:val="666666"/>
+              </w:rPr>
+            </w:pPr>
+          </w:p>
+          <w:p>
+            <w:pPr>
+              <w:spacing w:after="80"/>
+            </w:pPr>
+            <w:r>
+              <w:rPr>
+                <w:b/>
+                <w:bCs/>
+              </w:rPr>
               <w:t>Metric Analysis:</w:t>
             </w:r>
           </w:p>
           <w:p>
             <w:pPr>
               <w:spacing w:after="200"/>
-            </w:pPr>
-            <w:r>
-              <w:rPr>
-                <w:i/>
-                <w:iCs/>
-                <w:color w:val="666666"/>
-              </w:rPr>
-              <w:t xml:space="preserve">Explain what the metrics indicate </w:t>
+              <w:rPr>
+                <w:i/>
+                <w:iCs/>
+                <w:color w:val="666666"/>
+              </w:rPr>
+            </w:pPr>
+            <w:r>
+              <w:rPr>
+                <w:i/>
+                <w:iCs/>
+                <w:color w:val="666666"/>
+              </w:rPr>
+              <w:t>The baseline CNN achieved a relatively high validation accuracy of 73.25%, which initially suggests strong overall performance. However, the validation UAR is much lower at 38.78%, indicating that the model performs unevenly across classes. This difference shows that the model is heavily biased toward the majority class (NV), which dominates the dataset.</w:t>
+            </w:r>
+          </w:p>
+          <w:p>
+            <w:pPr>
+              <w:spacing w:after="200"/>
+              <w:rPr>
+                <w:i/>
+                <w:iCs/>
+                <w:color w:val="666666"/>
+              </w:rPr>
+            </w:pPr>
+            <w:r>
+              <w:rPr>
+                <w:i/>
+                <w:iCs/>
+                <w:color w:val="666666"/>
+              </w:rPr>
+              <w:t>The confusion matrix confirms this imbalance issue. The model predicts the NV class very well, achieving an NV recall of 87.54%, while several minority classes perform poorly. In particular, DF has a recall of 0.00%, meaning the model completely failed to correctly identify any DF samples. AKIEC and VASC also show low recall values, indicating weak performance on rare classes.</w:t>
+            </w:r>
+          </w:p>
+          <w:p>
+            <w:pPr>
+              <w:spacing w:after="200"/>
+              <w:rPr>
+                <w:i/>
+                <w:iCs/>
+                <w:color w:val="666666"/>
+              </w:rPr>
+            </w:pPr>
+            <w:r>
+              <w:rPr>
+                <w:i/>
+                <w:iCs/>
+                <w:color w:val="666666"/>
+              </w:rPr>
+              <w:t>This demonstrates that overall accuracy alone is misleading for imbalanced datasets. A model can achieve high accuracy by mainly predicting the dominant class while failing to correctly classify minority categories. Therefore, UAR is a more reliable evaluation metric in this task because it measures performance equally across all classes. The baseline results justify the need for imbalance-handling techniques in Task 1d, such as weighted sampling or class-weighted loss functions.</w:t>
             </w:r>
           </w:p>
         </w:tc>
@@ -629,15 +1446,92 @@
             </w:r>
           </w:p>
           <w:p>
-            <w:r>
-              <w:rPr>
-                <w:i/>
-                <w:iCs/>
-                <w:color w:val="666666"/>
-              </w:rPr>
-              <w:t>Insert your answer here</w:t>
-            </w:r>
-          </w:p>
+            <w:pPr>
+              <w:rPr>
+                <w:i/>
+                <w:iCs/>
+                <w:color w:val="666666"/>
+              </w:rPr>
+            </w:pPr>
+            <w:r>
+              <w:rPr>
+                <w:i/>
+                <w:iCs/>
+                <w:color w:val="666666"/>
+              </w:rPr>
+              <w:t>The main issue identified in Task 1a was a severe class imbalance in the training data. The Melanocytic nevus (NV) class dominated the dataset (approximately 68% of training images), while several classes — particularly Dermatofibroma (DF), Vascular Lesion (VASC), and Actinic keratosis (AKIEC) — were heavily under-represented. As the baseline confusion matrix confirmed, this caused the model to become biased toward the majority class, achieving high overall accuracy but poor recall on the rare classes (and a correspondingly low UAR).</w:t>
+            </w:r>
+          </w:p>
+          <w:p>
+            <w:pPr>
+              <w:rPr>
+                <w:i/>
+                <w:iCs/>
+                <w:color w:val="666666"/>
+              </w:rPr>
+            </w:pPr>
+            <w:r>
+              <w:rPr>
+                <w:i/>
+                <w:iCs/>
+                <w:color w:val="666666"/>
+              </w:rPr>
+              <w:t xml:space="preserve">To account for this, I rebalanced the training data using a </w:t>
+            </w:r>
+            <w:r>
+              <w:rPr>
+                <w:b/>
+                <w:bCs/>
+                <w:i/>
+                <w:iCs/>
+                <w:color w:val="666666"/>
+              </w:rPr>
+              <w:t>WeightedRandomSampler</w:t>
+            </w:r>
+            <w:r>
+              <w:rPr>
+                <w:i/>
+                <w:iCs/>
+                <w:color w:val="666666"/>
+              </w:rPr>
+              <w:t xml:space="preserve"> in the training DataLoader. First, I computed the per-class counts from train_dataset.labels. From these counts I calculated inverse-frequency class weights (1 / count) so that rarer classes receive a larger weight and the dominant NV class a smaller one. Each individual training example was then assigned a sampling weight according to its class. The training DataLoader was configured with sampler=weighted_sampler instead of shuffle=True, so that each epoch draws a roughly class-balanced stream of images, with minority-class examples sampled more frequently.</w:t>
+            </w:r>
+          </w:p>
+          <w:p>
+            <w:pPr>
+              <w:rPr>
+                <w:i/>
+                <w:iCs/>
+                <w:color w:val="666666"/>
+              </w:rPr>
+            </w:pPr>
+            <w:r>
+              <w:rPr>
+                <w:i/>
+                <w:iCs/>
+                <w:color w:val="666666"/>
+              </w:rPr>
+              <w:t>Importantly, the validation set was left completely unchanged — it was neither sampled nor reweighted — so that validation metrics still reflect the true, naturally imbalanced data distribution and remain comparable to the baseline. I also deliberately kept a plain CrossEntropyLoss rather than additionally applying a class-weighted loss, so that the only major change relative to the baseline was the sampler itself. This isolates the effect of the rebalancing strategy and makes the comparison with the Task 1c baseline fair.</w:t>
+            </w:r>
+          </w:p>
+          <w:p>
+            <w:pPr>
+              <w:rPr>
+                <w:i/>
+                <w:iCs/>
+                <w:color w:val="666666"/>
+              </w:rPr>
+            </w:pPr>
+            <w:r>
+              <w:rPr>
+                <w:i/>
+                <w:iCs/>
+                <w:color w:val="666666"/>
+              </w:rPr>
+              <w:t>The goal of this approach was to expose the model more frequently to minority-class examples during training, reducing its bias toward the majority class and encouraging it to learn the features of the rare lesion types.</w:t>
+            </w:r>
+          </w:p>
+          <w:p/>
         </w:tc>
       </w:tr>
     </w:tbl>
@@ -663,7 +1557,7 @@
     </w:p>
     <w:tbl>
       <w:tblPr>
-        <w:tblW w:w="9360" w:type="dxa"/>
+        <w:tblW w:w="10055" w:type="dxa"/>
         <w:tblBorders>
           <w:top w:val="single" w:sz="4" w:space="0" w:color="auto"/>
           <w:left w:val="single" w:sz="4" w:space="0" w:color="auto"/>
@@ -679,12 +1573,12 @@
         <w:tblLook w:val="04A0" w:firstRow="1" w:lastRow="0" w:firstColumn="1" w:lastColumn="0" w:noHBand="0" w:noVBand="1"/>
       </w:tblPr>
       <w:tblGrid>
-        <w:gridCol w:w="9360"/>
+        <w:gridCol w:w="10055"/>
       </w:tblGrid>
       <w:tr>
         <w:tc>
           <w:tcPr>
-            <w:tcW w:w="9360" w:type="dxa"/>
+            <w:tcW w:w="10055" w:type="dxa"/>
             <w:tcBorders>
               <w:top w:val="single" w:sz="8" w:space="0" w:color="CCCCCC"/>
               <w:left w:val="single" w:sz="8" w:space="0" w:color="CCCCCC"/>
@@ -714,39 +1608,789 @@
           <w:p>
             <w:pPr>
               <w:spacing w:after="200"/>
-              <w:rPr>
-                <w:i/>
-                <w:iCs/>
-                <w:color w:val="666666"/>
-              </w:rPr>
-            </w:pPr>
-            <w:r>
-              <w:rPr>
-                <w:i/>
-                <w:iCs/>
-                <w:color w:val="666666"/>
-              </w:rPr>
-              <w:t>Insert Plot or Metric Table Here</w:t>
-            </w:r>
-          </w:p>
-          <w:p>
-            <w:pPr>
-              <w:spacing w:after="200"/>
-              <w:rPr>
-                <w:i/>
-                <w:iCs/>
-                <w:color w:val="666666"/>
-              </w:rPr>
-            </w:pPr>
-            <w:r>
-              <w:rPr>
-                <w:i/>
-                <w:iCs/>
-                <w:color w:val="666666"/>
-              </w:rPr>
-              <w:t>Insert table with results from other metrics here</w:t>
-            </w:r>
-          </w:p>
+              <w:jc w:val="center"/>
+              <w:rPr>
+                <w:i/>
+                <w:iCs/>
+                <w:color w:val="666666"/>
+              </w:rPr>
+            </w:pPr>
+            <w:r>
+              <w:rPr>
+                <w:i/>
+                <w:iCs/>
+                <w:noProof/>
+                <w:color w:val="666666"/>
+              </w:rPr>
+              <w:drawing>
+                <wp:inline distT="0" distB="0" distL="0" distR="0" wp14:anchorId="1407BCE2" wp14:editId="6DCBF19A">
+                  <wp:extent cx="4654790" cy="3816350"/>
+                  <wp:effectExtent l="0" t="0" r="0" b="0"/>
+                  <wp:docPr id="35207681" name="Picture 3"/>
+                  <wp:cNvGraphicFramePr>
+                    <a:graphicFrameLocks xmlns:a="http://schemas.openxmlformats.org/drawingml/2006/main" noChangeAspect="1"/>
+                  </wp:cNvGraphicFramePr>
+                  <a:graphic xmlns:a="http://schemas.openxmlformats.org/drawingml/2006/main">
+                    <a:graphicData uri="http://schemas.openxmlformats.org/drawingml/2006/picture">
+                      <pic:pic xmlns:pic="http://schemas.openxmlformats.org/drawingml/2006/picture">
+                        <pic:nvPicPr>
+                          <pic:cNvPr id="35207681" name="Picture 35207681"/>
+                          <pic:cNvPicPr/>
+                        </pic:nvPicPr>
+                        <pic:blipFill>
+                          <a:blip r:embed="rId6">
+                            <a:extLst>
+                              <a:ext uri="{28A0092B-C50C-407E-A947-70E740481C1C}">
+                                <a14:useLocalDpi xmlns:a14="http://schemas.microsoft.com/office/drawing/2010/main" val="0"/>
+                              </a:ext>
+                            </a:extLst>
+                          </a:blip>
+                          <a:stretch>
+                            <a:fillRect/>
+                          </a:stretch>
+                        </pic:blipFill>
+                        <pic:spPr>
+                          <a:xfrm>
+                            <a:off x="0" y="0"/>
+                            <a:ext cx="4659519" cy="3820227"/>
+                          </a:xfrm>
+                          <a:prstGeom prst="rect">
+                            <a:avLst/>
+                          </a:prstGeom>
+                        </pic:spPr>
+                      </pic:pic>
+                    </a:graphicData>
+                  </a:graphic>
+                </wp:inline>
+              </w:drawing>
+            </w:r>
+          </w:p>
+          <w:tbl>
+            <w:tblPr>
+              <w:tblStyle w:val="TableGrid"/>
+              <w:tblW w:w="9474" w:type="dxa"/>
+              <w:jc w:val="center"/>
+              <w:tblLook w:val="04A0" w:firstRow="1" w:lastRow="0" w:firstColumn="1" w:lastColumn="0" w:noHBand="0" w:noVBand="1"/>
+            </w:tblPr>
+            <w:tblGrid>
+              <w:gridCol w:w="1820"/>
+              <w:gridCol w:w="2693"/>
+              <w:gridCol w:w="4961"/>
+            </w:tblGrid>
+            <w:tr>
+              <w:trPr>
+                <w:jc w:val="center"/>
+              </w:trPr>
+              <w:tc>
+                <w:tcPr>
+                  <w:tcW w:w="1820" w:type="dxa"/>
+                  <w:hideMark/>
+                </w:tcPr>
+                <w:p>
+                  <w:pPr>
+                    <w:jc w:val="center"/>
+                    <w:rPr>
+                      <w:rFonts w:eastAsia="Times New Roman"/>
+                      <w:b/>
+                      <w:bCs/>
+                      <w:lang w:bidi="bn-BD"/>
+                    </w:rPr>
+                  </w:pPr>
+                  <w:r>
+                    <w:rPr>
+                      <w:rFonts w:eastAsia="Times New Roman"/>
+                      <w:b/>
+                      <w:bCs/>
+                      <w:lang w:bidi="bn-BD"/>
+                    </w:rPr>
+                    <w:t>Metric</w:t>
+                  </w:r>
+                </w:p>
+              </w:tc>
+              <w:tc>
+                <w:tcPr>
+                  <w:tcW w:w="2693" w:type="dxa"/>
+                  <w:hideMark/>
+                </w:tcPr>
+                <w:p>
+                  <w:pPr>
+                    <w:jc w:val="right"/>
+                    <w:rPr>
+                      <w:rFonts w:eastAsia="Times New Roman"/>
+                      <w:b/>
+                      <w:bCs/>
+                      <w:lang w:bidi="bn-BD"/>
+                    </w:rPr>
+                  </w:pPr>
+                  <w:r>
+                    <w:rPr>
+                      <w:rFonts w:eastAsia="Times New Roman"/>
+                      <w:b/>
+                      <w:bCs/>
+                      <w:lang w:bidi="bn-BD"/>
+                    </w:rPr>
+                    <w:t>Baseline CNN (Task 1c)</w:t>
+                  </w:r>
+                </w:p>
+              </w:tc>
+              <w:tc>
+                <w:tcPr>
+                  <w:tcW w:w="4961" w:type="dxa"/>
+                  <w:hideMark/>
+                </w:tcPr>
+                <w:p>
+                  <w:pPr>
+                    <w:jc w:val="right"/>
+                    <w:rPr>
+                      <w:rFonts w:eastAsia="Times New Roman"/>
+                      <w:b/>
+                      <w:bCs/>
+                      <w:lang w:bidi="bn-BD"/>
+                    </w:rPr>
+                  </w:pPr>
+                  <w:r>
+                    <w:rPr>
+                      <w:rFonts w:eastAsia="Times New Roman"/>
+                      <w:b/>
+                      <w:bCs/>
+                      <w:lang w:bidi="bn-BD"/>
+                    </w:rPr>
+                    <w:t>WeightedRandomSampler Model (Task 1d)</w:t>
+                  </w:r>
+                </w:p>
+              </w:tc>
+            </w:tr>
+            <w:tr>
+              <w:trPr>
+                <w:jc w:val="center"/>
+              </w:trPr>
+              <w:tc>
+                <w:tcPr>
+                  <w:tcW w:w="1820" w:type="dxa"/>
+                  <w:hideMark/>
+                </w:tcPr>
+                <w:p>
+                  <w:pPr>
+                    <w:rPr>
+                      <w:rFonts w:eastAsia="Times New Roman"/>
+                      <w:lang w:bidi="bn-BD"/>
+                    </w:rPr>
+                  </w:pPr>
+                  <w:r>
+                    <w:rPr>
+                      <w:rFonts w:eastAsia="Times New Roman"/>
+                      <w:lang w:bidi="bn-BD"/>
+                    </w:rPr>
+                    <w:t>Validation Accuracy</w:t>
+                  </w:r>
+                </w:p>
+              </w:tc>
+              <w:tc>
+                <w:tcPr>
+                  <w:tcW w:w="2693" w:type="dxa"/>
+                  <w:hideMark/>
+                </w:tcPr>
+                <w:p>
+                  <w:pPr>
+                    <w:jc w:val="center"/>
+                    <w:rPr>
+                      <w:rFonts w:eastAsia="Times New Roman"/>
+                      <w:lang w:bidi="bn-BD"/>
+                    </w:rPr>
+                  </w:pPr>
+                  <w:r>
+                    <w:rPr>
+                      <w:rFonts w:eastAsia="Times New Roman"/>
+                      <w:lang w:bidi="bn-BD"/>
+                    </w:rPr>
+                    <w:t>0.7325</w:t>
+                  </w:r>
+                </w:p>
+              </w:tc>
+              <w:tc>
+                <w:tcPr>
+                  <w:tcW w:w="4961" w:type="dxa"/>
+                  <w:hideMark/>
+                </w:tcPr>
+                <w:p>
+                  <w:pPr>
+                    <w:jc w:val="center"/>
+                    <w:rPr>
+                      <w:rFonts w:eastAsia="Times New Roman"/>
+                      <w:lang w:bidi="bn-BD"/>
+                    </w:rPr>
+                  </w:pPr>
+                  <w:r>
+                    <w:rPr>
+                      <w:rFonts w:eastAsia="Times New Roman"/>
+                      <w:lang w:bidi="bn-BD"/>
+                    </w:rPr>
+                    <w:t>0.6425</w:t>
+                  </w:r>
+                </w:p>
+              </w:tc>
+            </w:tr>
+            <w:tr>
+              <w:trPr>
+                <w:jc w:val="center"/>
+              </w:trPr>
+              <w:tc>
+                <w:tcPr>
+                  <w:tcW w:w="1820" w:type="dxa"/>
+                  <w:hideMark/>
+                </w:tcPr>
+                <w:p>
+                  <w:pPr>
+                    <w:rPr>
+                      <w:rFonts w:eastAsia="Times New Roman"/>
+                      <w:lang w:bidi="bn-BD"/>
+                    </w:rPr>
+                  </w:pPr>
+                  <w:r>
+                    <w:rPr>
+                      <w:rFonts w:eastAsia="Times New Roman"/>
+                      <w:lang w:bidi="bn-BD"/>
+                    </w:rPr>
+                    <w:t>Validation UAR</w:t>
+                  </w:r>
+                </w:p>
+              </w:tc>
+              <w:tc>
+                <w:tcPr>
+                  <w:tcW w:w="2693" w:type="dxa"/>
+                  <w:hideMark/>
+                </w:tcPr>
+                <w:p>
+                  <w:pPr>
+                    <w:jc w:val="center"/>
+                    <w:rPr>
+                      <w:rFonts w:eastAsia="Times New Roman"/>
+                      <w:lang w:bidi="bn-BD"/>
+                    </w:rPr>
+                  </w:pPr>
+                  <w:r>
+                    <w:rPr>
+                      <w:rFonts w:eastAsia="Times New Roman"/>
+                      <w:lang w:bidi="bn-BD"/>
+                    </w:rPr>
+                    <w:t>0.3878</w:t>
+                  </w:r>
+                </w:p>
+              </w:tc>
+              <w:tc>
+                <w:tcPr>
+                  <w:tcW w:w="4961" w:type="dxa"/>
+                  <w:hideMark/>
+                </w:tcPr>
+                <w:p>
+                  <w:pPr>
+                    <w:jc w:val="center"/>
+                    <w:rPr>
+                      <w:rFonts w:eastAsia="Times New Roman"/>
+                      <w:lang w:bidi="bn-BD"/>
+                    </w:rPr>
+                  </w:pPr>
+                  <w:r>
+                    <w:rPr>
+                      <w:rFonts w:eastAsia="Times New Roman"/>
+                      <w:lang w:bidi="bn-BD"/>
+                    </w:rPr>
+                    <w:t>0.5054</w:t>
+                  </w:r>
+                </w:p>
+              </w:tc>
+            </w:tr>
+            <w:tr>
+              <w:trPr>
+                <w:jc w:val="center"/>
+              </w:trPr>
+              <w:tc>
+                <w:tcPr>
+                  <w:tcW w:w="1820" w:type="dxa"/>
+                  <w:hideMark/>
+                </w:tcPr>
+                <w:p>
+                  <w:pPr>
+                    <w:rPr>
+                      <w:rFonts w:eastAsia="Times New Roman"/>
+                      <w:lang w:bidi="bn-BD"/>
+                    </w:rPr>
+                  </w:pPr>
+                  <w:r>
+                    <w:rPr>
+                      <w:rFonts w:eastAsia="Times New Roman"/>
+                      <w:lang w:bidi="bn-BD"/>
+                    </w:rPr>
+                    <w:t>MEL Recall</w:t>
+                  </w:r>
+                </w:p>
+              </w:tc>
+              <w:tc>
+                <w:tcPr>
+                  <w:tcW w:w="2693" w:type="dxa"/>
+                  <w:hideMark/>
+                </w:tcPr>
+                <w:p>
+                  <w:pPr>
+                    <w:jc w:val="center"/>
+                    <w:rPr>
+                      <w:rFonts w:eastAsia="Times New Roman"/>
+                      <w:lang w:bidi="bn-BD"/>
+                    </w:rPr>
+                  </w:pPr>
+                  <w:r>
+                    <w:rPr>
+                      <w:rFonts w:eastAsia="Times New Roman"/>
+                      <w:lang w:bidi="bn-BD"/>
+                    </w:rPr>
+                    <w:t>0.4062</w:t>
+                  </w:r>
+                </w:p>
+              </w:tc>
+              <w:tc>
+                <w:tcPr>
+                  <w:tcW w:w="4961" w:type="dxa"/>
+                  <w:hideMark/>
+                </w:tcPr>
+                <w:p>
+                  <w:pPr>
+                    <w:jc w:val="center"/>
+                    <w:rPr>
+                      <w:rFonts w:eastAsia="Times New Roman"/>
+                      <w:lang w:bidi="bn-BD"/>
+                    </w:rPr>
+                  </w:pPr>
+                  <w:r>
+                    <w:rPr>
+                      <w:rFonts w:eastAsia="Times New Roman"/>
+                      <w:lang w:bidi="bn-BD"/>
+                    </w:rPr>
+                    <w:t>0.4062</w:t>
+                  </w:r>
+                </w:p>
+              </w:tc>
+            </w:tr>
+            <w:tr>
+              <w:trPr>
+                <w:jc w:val="center"/>
+              </w:trPr>
+              <w:tc>
+                <w:tcPr>
+                  <w:tcW w:w="1820" w:type="dxa"/>
+                  <w:hideMark/>
+                </w:tcPr>
+                <w:p>
+                  <w:pPr>
+                    <w:rPr>
+                      <w:rFonts w:eastAsia="Times New Roman"/>
+                      <w:lang w:bidi="bn-BD"/>
+                    </w:rPr>
+                  </w:pPr>
+                  <w:r>
+                    <w:rPr>
+                      <w:rFonts w:eastAsia="Times New Roman"/>
+                      <w:lang w:bidi="bn-BD"/>
+                    </w:rPr>
+                    <w:t>NV Recall</w:t>
+                  </w:r>
+                </w:p>
+              </w:tc>
+              <w:tc>
+                <w:tcPr>
+                  <w:tcW w:w="2693" w:type="dxa"/>
+                  <w:hideMark/>
+                </w:tcPr>
+                <w:p>
+                  <w:pPr>
+                    <w:jc w:val="center"/>
+                    <w:rPr>
+                      <w:rFonts w:eastAsia="Times New Roman"/>
+                      <w:lang w:bidi="bn-BD"/>
+                    </w:rPr>
+                  </w:pPr>
+                  <w:r>
+                    <w:rPr>
+                      <w:rFonts w:eastAsia="Times New Roman"/>
+                      <w:lang w:bidi="bn-BD"/>
+                    </w:rPr>
+                    <w:t>0.8754</w:t>
+                  </w:r>
+                </w:p>
+              </w:tc>
+              <w:tc>
+                <w:tcPr>
+                  <w:tcW w:w="4961" w:type="dxa"/>
+                  <w:hideMark/>
+                </w:tcPr>
+                <w:p>
+                  <w:pPr>
+                    <w:jc w:val="center"/>
+                    <w:rPr>
+                      <w:rFonts w:eastAsia="Times New Roman"/>
+                      <w:lang w:bidi="bn-BD"/>
+                    </w:rPr>
+                  </w:pPr>
+                  <w:r>
+                    <w:rPr>
+                      <w:rFonts w:eastAsia="Times New Roman"/>
+                      <w:lang w:bidi="bn-BD"/>
+                    </w:rPr>
+                    <w:t>0.7189</w:t>
+                  </w:r>
+                </w:p>
+              </w:tc>
+            </w:tr>
+            <w:tr>
+              <w:trPr>
+                <w:jc w:val="center"/>
+              </w:trPr>
+              <w:tc>
+                <w:tcPr>
+                  <w:tcW w:w="1820" w:type="dxa"/>
+                  <w:hideMark/>
+                </w:tcPr>
+                <w:p>
+                  <w:pPr>
+                    <w:rPr>
+                      <w:rFonts w:eastAsia="Times New Roman"/>
+                      <w:lang w:bidi="bn-BD"/>
+                    </w:rPr>
+                  </w:pPr>
+                  <w:r>
+                    <w:rPr>
+                      <w:rFonts w:eastAsia="Times New Roman"/>
+                      <w:lang w:bidi="bn-BD"/>
+                    </w:rPr>
+                    <w:t>BCC Recall</w:t>
+                  </w:r>
+                </w:p>
+              </w:tc>
+              <w:tc>
+                <w:tcPr>
+                  <w:tcW w:w="2693" w:type="dxa"/>
+                  <w:hideMark/>
+                </w:tcPr>
+                <w:p>
+                  <w:pPr>
+                    <w:jc w:val="center"/>
+                    <w:rPr>
+                      <w:rFonts w:eastAsia="Times New Roman"/>
+                      <w:lang w:bidi="bn-BD"/>
+                    </w:rPr>
+                  </w:pPr>
+                  <w:r>
+                    <w:rPr>
+                      <w:rFonts w:eastAsia="Times New Roman"/>
+                      <w:lang w:bidi="bn-BD"/>
+                    </w:rPr>
+                    <w:t>0.6190</w:t>
+                  </w:r>
+                </w:p>
+              </w:tc>
+              <w:tc>
+                <w:tcPr>
+                  <w:tcW w:w="4961" w:type="dxa"/>
+                  <w:hideMark/>
+                </w:tcPr>
+                <w:p>
+                  <w:pPr>
+                    <w:jc w:val="center"/>
+                    <w:rPr>
+                      <w:rFonts w:eastAsia="Times New Roman"/>
+                      <w:lang w:bidi="bn-BD"/>
+                    </w:rPr>
+                  </w:pPr>
+                  <w:r>
+                    <w:rPr>
+                      <w:rFonts w:eastAsia="Times New Roman"/>
+                      <w:lang w:bidi="bn-BD"/>
+                    </w:rPr>
+                    <w:t>0.5238</w:t>
+                  </w:r>
+                </w:p>
+              </w:tc>
+            </w:tr>
+            <w:tr>
+              <w:trPr>
+                <w:jc w:val="center"/>
+              </w:trPr>
+              <w:tc>
+                <w:tcPr>
+                  <w:tcW w:w="1820" w:type="dxa"/>
+                  <w:hideMark/>
+                </w:tcPr>
+                <w:p>
+                  <w:pPr>
+                    <w:rPr>
+                      <w:rFonts w:eastAsia="Times New Roman"/>
+                      <w:lang w:bidi="bn-BD"/>
+                    </w:rPr>
+                  </w:pPr>
+                  <w:r>
+                    <w:rPr>
+                      <w:rFonts w:eastAsia="Times New Roman"/>
+                      <w:lang w:bidi="bn-BD"/>
+                    </w:rPr>
+                    <w:t>AKIEC Recall</w:t>
+                  </w:r>
+                </w:p>
+              </w:tc>
+              <w:tc>
+                <w:tcPr>
+                  <w:tcW w:w="2693" w:type="dxa"/>
+                  <w:hideMark/>
+                </w:tcPr>
+                <w:p>
+                  <w:pPr>
+                    <w:jc w:val="center"/>
+                    <w:rPr>
+                      <w:rFonts w:eastAsia="Times New Roman"/>
+                      <w:lang w:bidi="bn-BD"/>
+                    </w:rPr>
+                  </w:pPr>
+                  <w:r>
+                    <w:rPr>
+                      <w:rFonts w:eastAsia="Times New Roman"/>
+                      <w:lang w:bidi="bn-BD"/>
+                    </w:rPr>
+                    <w:t>0.1667</w:t>
+                  </w:r>
+                </w:p>
+              </w:tc>
+              <w:tc>
+                <w:tcPr>
+                  <w:tcW w:w="4961" w:type="dxa"/>
+                  <w:hideMark/>
+                </w:tcPr>
+                <w:p>
+                  <w:pPr>
+                    <w:jc w:val="center"/>
+                    <w:rPr>
+                      <w:rFonts w:eastAsia="Times New Roman"/>
+                      <w:lang w:bidi="bn-BD"/>
+                    </w:rPr>
+                  </w:pPr>
+                  <w:r>
+                    <w:rPr>
+                      <w:rFonts w:eastAsia="Times New Roman"/>
+                      <w:lang w:bidi="bn-BD"/>
+                    </w:rPr>
+                    <w:t>0.3889</w:t>
+                  </w:r>
+                </w:p>
+              </w:tc>
+            </w:tr>
+            <w:tr>
+              <w:trPr>
+                <w:jc w:val="center"/>
+              </w:trPr>
+              <w:tc>
+                <w:tcPr>
+                  <w:tcW w:w="1820" w:type="dxa"/>
+                  <w:hideMark/>
+                </w:tcPr>
+                <w:p>
+                  <w:pPr>
+                    <w:rPr>
+                      <w:rFonts w:eastAsia="Times New Roman"/>
+                      <w:lang w:bidi="bn-BD"/>
+                    </w:rPr>
+                  </w:pPr>
+                  <w:r>
+                    <w:rPr>
+                      <w:rFonts w:eastAsia="Times New Roman"/>
+                      <w:lang w:bidi="bn-BD"/>
+                    </w:rPr>
+                    <w:t>BKL Recall</w:t>
+                  </w:r>
+                </w:p>
+              </w:tc>
+              <w:tc>
+                <w:tcPr>
+                  <w:tcW w:w="2693" w:type="dxa"/>
+                  <w:hideMark/>
+                </w:tcPr>
+                <w:p>
+                  <w:pPr>
+                    <w:jc w:val="center"/>
+                    <w:rPr>
+                      <w:rFonts w:eastAsia="Times New Roman"/>
+                      <w:lang w:bidi="bn-BD"/>
+                    </w:rPr>
+                  </w:pPr>
+                  <w:r>
+                    <w:rPr>
+                      <w:rFonts w:eastAsia="Times New Roman"/>
+                      <w:lang w:bidi="bn-BD"/>
+                    </w:rPr>
+                    <w:t>0.4474</w:t>
+                  </w:r>
+                </w:p>
+              </w:tc>
+              <w:tc>
+                <w:tcPr>
+                  <w:tcW w:w="4961" w:type="dxa"/>
+                  <w:hideMark/>
+                </w:tcPr>
+                <w:p>
+                  <w:pPr>
+                    <w:jc w:val="center"/>
+                    <w:rPr>
+                      <w:rFonts w:eastAsia="Times New Roman"/>
+                      <w:lang w:bidi="bn-BD"/>
+                    </w:rPr>
+                  </w:pPr>
+                  <w:r>
+                    <w:rPr>
+                      <w:rFonts w:eastAsia="Times New Roman"/>
+                      <w:lang w:bidi="bn-BD"/>
+                    </w:rPr>
+                    <w:t>0.5000</w:t>
+                  </w:r>
+                </w:p>
+              </w:tc>
+            </w:tr>
+            <w:tr>
+              <w:trPr>
+                <w:jc w:val="center"/>
+              </w:trPr>
+              <w:tc>
+                <w:tcPr>
+                  <w:tcW w:w="1820" w:type="dxa"/>
+                  <w:hideMark/>
+                </w:tcPr>
+                <w:p>
+                  <w:pPr>
+                    <w:rPr>
+                      <w:rFonts w:eastAsia="Times New Roman"/>
+                      <w:lang w:bidi="bn-BD"/>
+                    </w:rPr>
+                  </w:pPr>
+                  <w:r>
+                    <w:rPr>
+                      <w:rFonts w:eastAsia="Times New Roman"/>
+                      <w:lang w:bidi="bn-BD"/>
+                    </w:rPr>
+                    <w:t>DF Recall</w:t>
+                  </w:r>
+                </w:p>
+              </w:tc>
+              <w:tc>
+                <w:tcPr>
+                  <w:tcW w:w="2693" w:type="dxa"/>
+                  <w:hideMark/>
+                </w:tcPr>
+                <w:p>
+                  <w:pPr>
+                    <w:jc w:val="center"/>
+                    <w:rPr>
+                      <w:rFonts w:eastAsia="Times New Roman"/>
+                      <w:lang w:bidi="bn-BD"/>
+                    </w:rPr>
+                  </w:pPr>
+                  <w:r>
+                    <w:rPr>
+                      <w:rFonts w:eastAsia="Times New Roman"/>
+                      <w:lang w:bidi="bn-BD"/>
+                    </w:rPr>
+                    <w:t>0.0000</w:t>
+                  </w:r>
+                </w:p>
+              </w:tc>
+              <w:tc>
+                <w:tcPr>
+                  <w:tcW w:w="4961" w:type="dxa"/>
+                  <w:hideMark/>
+                </w:tcPr>
+                <w:p>
+                  <w:pPr>
+                    <w:jc w:val="center"/>
+                    <w:rPr>
+                      <w:rFonts w:eastAsia="Times New Roman"/>
+                      <w:lang w:bidi="bn-BD"/>
+                    </w:rPr>
+                  </w:pPr>
+                  <w:r>
+                    <w:rPr>
+                      <w:rFonts w:eastAsia="Times New Roman"/>
+                      <w:lang w:bidi="bn-BD"/>
+                    </w:rPr>
+                    <w:t>0.2000</w:t>
+                  </w:r>
+                </w:p>
+              </w:tc>
+            </w:tr>
+            <w:tr>
+              <w:trPr>
+                <w:jc w:val="center"/>
+              </w:trPr>
+              <w:tc>
+                <w:tcPr>
+                  <w:tcW w:w="1820" w:type="dxa"/>
+                  <w:hideMark/>
+                </w:tcPr>
+                <w:p>
+                  <w:pPr>
+                    <w:rPr>
+                      <w:rFonts w:eastAsia="Times New Roman"/>
+                      <w:lang w:bidi="bn-BD"/>
+                    </w:rPr>
+                  </w:pPr>
+                  <w:r>
+                    <w:rPr>
+                      <w:rFonts w:eastAsia="Times New Roman"/>
+                      <w:lang w:bidi="bn-BD"/>
+                    </w:rPr>
+                    <w:t>VASC Recall</w:t>
+                  </w:r>
+                </w:p>
+              </w:tc>
+              <w:tc>
+                <w:tcPr>
+                  <w:tcW w:w="2693" w:type="dxa"/>
+                  <w:hideMark/>
+                </w:tcPr>
+                <w:p>
+                  <w:pPr>
+                    <w:jc w:val="center"/>
+                    <w:rPr>
+                      <w:rFonts w:eastAsia="Times New Roman"/>
+                      <w:lang w:bidi="bn-BD"/>
+                    </w:rPr>
+                  </w:pPr>
+                  <w:r>
+                    <w:rPr>
+                      <w:rFonts w:eastAsia="Times New Roman"/>
+                      <w:lang w:bidi="bn-BD"/>
+                    </w:rPr>
+                    <w:t>0.2000</w:t>
+                  </w:r>
+                </w:p>
+              </w:tc>
+              <w:tc>
+                <w:tcPr>
+                  <w:tcW w:w="4961" w:type="dxa"/>
+                  <w:hideMark/>
+                </w:tcPr>
+                <w:p>
+                  <w:pPr>
+                    <w:jc w:val="center"/>
+                    <w:rPr>
+                      <w:rFonts w:eastAsia="Times New Roman"/>
+                      <w:lang w:bidi="bn-BD"/>
+                    </w:rPr>
+                  </w:pPr>
+                  <w:r>
+                    <w:rPr>
+                      <w:rFonts w:eastAsia="Times New Roman"/>
+                      <w:lang w:bidi="bn-BD"/>
+                    </w:rPr>
+                    <w:t>0.8000</w:t>
+                  </w:r>
+                </w:p>
+              </w:tc>
+            </w:tr>
+          </w:tbl>
           <w:p>
             <w:pPr>
               <w:spacing w:after="200"/>
@@ -765,13 +2409,46 @@
             </w:r>
           </w:p>
           <w:p>
-            <w:r>
-              <w:rPr>
-                <w:i/>
-                <w:iCs/>
-                <w:color w:val="666666"/>
-              </w:rPr>
-              <w:t>Insert your answer here</w:t>
+            <w:pPr>
+              <w:rPr>
+                <w:i/>
+                <w:iCs/>
+                <w:color w:val="666666"/>
+              </w:rPr>
+            </w:pPr>
+            <w:r>
+              <w:rPr>
+                <w:i/>
+                <w:iCs/>
+                <w:color w:val="666666"/>
+              </w:rPr>
+              <w:t>The imbalance-handling strategy was successful because the model became significantly better at recognising minority classes after applying the WeightedRandomSampler. Although the overall validation accuracy decreased slightly (from 73.25% to 64.25%), the Validation UAR improved from 0.3878 to 0.5054, showing that performance became more balanced across all classes rather than being dominated by the majority NV class.</w:t>
+            </w:r>
+          </w:p>
+          <w:p>
+            <w:pPr>
+              <w:rPr>
+                <w:i/>
+                <w:iCs/>
+                <w:color w:val="666666"/>
+              </w:rPr>
+            </w:pPr>
+          </w:p>
+          <w:p>
+            <w:pPr>
+              <w:rPr>
+                <w:i/>
+                <w:iCs/>
+                <w:color w:val="666666"/>
+              </w:rPr>
+            </w:pPr>
+            <w:r>
+              <w:rPr>
+                <w:i/>
+                <w:iCs/>
+                <w:color w:val="666666"/>
+              </w:rPr>
+              <w:t>The confusion matrix and per-class recall values also confirm this improvement. Rare classes such as AKIEC, DF, and VASC achieved noticeably higher recall after rebalancing, while the model relied less heavily on predicting NV. This demonstrates that the sampler successfully reduced class bias and encouraged the model to learn features from under-represented lesion categories instead of mainly optimising for the dominant class.</w:t>
             </w:r>
           </w:p>
         </w:tc>
@@ -864,13 +2541,46 @@
             </w:r>
           </w:p>
           <w:p>
-            <w:r>
-              <w:rPr>
-                <w:i/>
-                <w:iCs/>
-                <w:color w:val="666666"/>
-              </w:rPr>
-              <w:t>Insert your answer here</w:t>
+            <w:pPr>
+              <w:rPr>
+                <w:i/>
+                <w:iCs/>
+                <w:color w:val="666666"/>
+              </w:rPr>
+            </w:pPr>
+            <w:r>
+              <w:rPr>
+                <w:i/>
+                <w:iCs/>
+                <w:color w:val="666666"/>
+              </w:rPr>
+              <w:t>Yes, random vertical flips are an appropriate augmentation for this dataset. Dermoscopic images of skin lesions have no canonical orientation: a mole or lesion photographed through a dermatoscope has no inherent “top” or “bottom”, and the diagnostic class depends on features such as colour, texture, border and structure rather than on image orientation. Flipping such an image vertically therefore produces a realistic example that could still occur in practice while preserving the original label. This makes vertical flipping a label-preserving augmentation that increases orientation diversity during training.</w:t>
+            </w:r>
+          </w:p>
+          <w:p>
+            <w:pPr>
+              <w:rPr>
+                <w:i/>
+                <w:iCs/>
+                <w:color w:val="666666"/>
+              </w:rPr>
+            </w:pPr>
+          </w:p>
+          <w:p>
+            <w:pPr>
+              <w:rPr>
+                <w:i/>
+                <w:iCs/>
+                <w:color w:val="666666"/>
+              </w:rPr>
+            </w:pPr>
+            <w:r>
+              <w:rPr>
+                <w:i/>
+                <w:iCs/>
+                <w:color w:val="666666"/>
+              </w:rPr>
+              <w:t>This differs from datasets such as human faces or natural street scenes, where images have a strong semantic orientation. Vertically flipping those images creates unrealistic inputs and may confuse the model. Since skin lesions do not contain this type of orientation prior, vertical flipping is a reasonable augmentation strategy for this task.</w:t>
             </w:r>
           </w:p>
         </w:tc>
@@ -949,39 +2659,1168 @@
           <w:p>
             <w:pPr>
               <w:spacing w:after="200"/>
-            </w:pPr>
-            <w:r>
-              <w:rPr>
-                <w:i/>
-                <w:iCs/>
-                <w:color w:val="666666"/>
-              </w:rPr>
-              <w:t>Insert your answer here</w:t>
+              <w:rPr>
+                <w:i/>
+                <w:iCs/>
+                <w:color w:val="666666"/>
+              </w:rPr>
+            </w:pPr>
+            <w:r>
+              <w:rPr>
+                <w:i/>
+                <w:iCs/>
+                <w:color w:val="666666"/>
+              </w:rPr>
+              <w:t>Two augmentation configurations were tested on top of the weighted-sampler baseline. Configuration A used only random horizontal flipping, while Configuration B used a stronger pipeline consisting of random horizontal flip, vertical flip, rotation, colour jitter, resizing and random cropping.</w:t>
+            </w:r>
+          </w:p>
+          <w:p>
+            <w:pPr>
+              <w:spacing w:after="200"/>
+              <w:rPr>
+                <w:i/>
+                <w:iCs/>
+                <w:color w:val="666666"/>
+              </w:rPr>
+            </w:pPr>
+            <w:r>
+              <w:rPr>
+                <w:i/>
+                <w:iCs/>
+                <w:color w:val="666666"/>
+              </w:rPr>
+              <w:t>The no-augmentation baseline achieved the highest validation accuracy (0.730), but this was mainly due to strong performance on the dominant NV class (recall 0.840), indicating remaining class imbalance bias. Configuration A (horizontal flip only) produced the best-balanced performance overall, increasing validation UAR from 0.529 to 0.586 while maintaining reasonable accuracy (0.692). It also improved recall for several minority classes, including MEL, BCC and AKIEC.</w:t>
+            </w:r>
+            <w:r>
+              <w:rPr>
+                <w:i/>
+                <w:iCs/>
+                <w:color w:val="666666"/>
+              </w:rPr>
+              <w:t xml:space="preserve"> </w:t>
+            </w:r>
+            <w:r>
+              <w:rPr>
+                <w:i/>
+                <w:iCs/>
+                <w:color w:val="666666"/>
+              </w:rPr>
+              <w:t>Configuration B (full augmentation pipeline) improved AKIEC recall substantially (0.944), but overall performance became less stable. Validation accuracy dropped to 0.533 and UAR decreased to 0.477, while some classes such as BKL performed poorly. This suggests the augmentation strength was too aggressive for only five training epochs and would likely require longer training to converge properly.</w:t>
+            </w:r>
+          </w:p>
+          <w:p>
+            <w:pPr>
+              <w:spacing w:after="200"/>
+              <w:rPr>
+                <w:i/>
+                <w:iCs/>
+                <w:color w:val="666666"/>
+              </w:rPr>
+            </w:pPr>
+            <w:r>
+              <w:rPr>
+                <w:i/>
+                <w:iCs/>
+                <w:color w:val="666666"/>
+              </w:rPr>
+              <w:t>Overall, the horizontal-flip-only configuration provided the best trade-off between balanced recall and overall model performance.</w:t>
             </w:r>
           </w:p>
           <w:p>
             <w:pPr>
               <w:spacing w:after="80"/>
-            </w:pPr>
-            <w:r>
               <w:rPr>
                 <w:b/>
                 <w:bCs/>
               </w:rPr>
-              <w:lastRenderedPageBreak/>
+            </w:pPr>
+            <w:r>
+              <w:rPr>
+                <w:b/>
+                <w:bCs/>
+              </w:rPr>
               <w:t>Evidence:</w:t>
             </w:r>
           </w:p>
-          <w:p>
-            <w:r>
-              <w:rPr>
-                <w:i/>
-                <w:iCs/>
-                <w:color w:val="666666"/>
-              </w:rPr>
-              <w:t>Insert Plot and/or Metric Table Here</w:t>
-            </w:r>
-          </w:p>
+          <w:tbl>
+            <w:tblPr>
+              <w:tblStyle w:val="TableGrid"/>
+              <w:tblW w:w="0" w:type="auto"/>
+              <w:tblLook w:val="04A0" w:firstRow="1" w:lastRow="0" w:firstColumn="1" w:lastColumn="0" w:noHBand="0" w:noVBand="1"/>
+            </w:tblPr>
+            <w:tblGrid>
+              <w:gridCol w:w="1678"/>
+              <w:gridCol w:w="871"/>
+              <w:gridCol w:w="1059"/>
+              <w:gridCol w:w="767"/>
+              <w:gridCol w:w="767"/>
+              <w:gridCol w:w="767"/>
+              <w:gridCol w:w="901"/>
+              <w:gridCol w:w="767"/>
+              <w:gridCol w:w="645"/>
+              <w:gridCol w:w="828"/>
+            </w:tblGrid>
+            <w:tr>
+              <w:tc>
+                <w:tcPr>
+                  <w:tcW w:w="1678" w:type="dxa"/>
+                  <w:hideMark/>
+                </w:tcPr>
+                <w:p>
+                  <w:pPr>
+                    <w:jc w:val="center"/>
+                    <w:rPr>
+                      <w:rFonts w:eastAsia="Times New Roman"/>
+                      <w:b/>
+                      <w:bCs/>
+                      <w:lang w:bidi="bn-BD"/>
+                    </w:rPr>
+                  </w:pPr>
+                  <w:r>
+                    <w:rPr>
+                      <w:rFonts w:eastAsia="Times New Roman"/>
+                      <w:b/>
+                      <w:bCs/>
+                      <w:lang w:bidi="bn-BD"/>
+                    </w:rPr>
+                    <w:t>Config</w:t>
+                  </w:r>
+                </w:p>
+              </w:tc>
+              <w:tc>
+                <w:tcPr>
+                  <w:tcW w:w="871" w:type="dxa"/>
+                  <w:hideMark/>
+                </w:tcPr>
+                <w:p>
+                  <w:pPr>
+                    <w:jc w:val="center"/>
+                    <w:rPr>
+                      <w:rFonts w:eastAsia="Times New Roman"/>
+                      <w:b/>
+                      <w:bCs/>
+                      <w:lang w:bidi="bn-BD"/>
+                    </w:rPr>
+                  </w:pPr>
+                  <w:r>
+                    <w:rPr>
+                      <w:rFonts w:eastAsia="Times New Roman"/>
+                      <w:b/>
+                      <w:bCs/>
+                      <w:lang w:bidi="bn-BD"/>
+                    </w:rPr>
+                    <w:t>Val Acc</w:t>
+                  </w:r>
+                </w:p>
+              </w:tc>
+              <w:tc>
+                <w:tcPr>
+                  <w:tcW w:w="0" w:type="auto"/>
+                  <w:hideMark/>
+                </w:tcPr>
+                <w:p>
+                  <w:pPr>
+                    <w:jc w:val="center"/>
+                    <w:rPr>
+                      <w:rFonts w:eastAsia="Times New Roman"/>
+                      <w:b/>
+                      <w:bCs/>
+                      <w:lang w:bidi="bn-BD"/>
+                    </w:rPr>
+                  </w:pPr>
+                  <w:r>
+                    <w:rPr>
+                      <w:rFonts w:eastAsia="Times New Roman"/>
+                      <w:b/>
+                      <w:bCs/>
+                      <w:lang w:bidi="bn-BD"/>
+                    </w:rPr>
+                    <w:t>Val UAR</w:t>
+                  </w:r>
+                </w:p>
+              </w:tc>
+              <w:tc>
+                <w:tcPr>
+                  <w:tcW w:w="0" w:type="auto"/>
+                  <w:hideMark/>
+                </w:tcPr>
+                <w:p>
+                  <w:pPr>
+                    <w:jc w:val="center"/>
+                    <w:rPr>
+                      <w:rFonts w:eastAsia="Times New Roman"/>
+                      <w:b/>
+                      <w:bCs/>
+                      <w:lang w:bidi="bn-BD"/>
+                    </w:rPr>
+                  </w:pPr>
+                  <w:r>
+                    <w:rPr>
+                      <w:rFonts w:eastAsia="Times New Roman"/>
+                      <w:b/>
+                      <w:bCs/>
+                      <w:lang w:bidi="bn-BD"/>
+                    </w:rPr>
+                    <w:t>MEL</w:t>
+                  </w:r>
+                </w:p>
+              </w:tc>
+              <w:tc>
+                <w:tcPr>
+                  <w:tcW w:w="0" w:type="auto"/>
+                  <w:hideMark/>
+                </w:tcPr>
+                <w:p>
+                  <w:pPr>
+                    <w:jc w:val="center"/>
+                    <w:rPr>
+                      <w:rFonts w:eastAsia="Times New Roman"/>
+                      <w:b/>
+                      <w:bCs/>
+                      <w:lang w:bidi="bn-BD"/>
+                    </w:rPr>
+                  </w:pPr>
+                  <w:r>
+                    <w:rPr>
+                      <w:rFonts w:eastAsia="Times New Roman"/>
+                      <w:b/>
+                      <w:bCs/>
+                      <w:lang w:bidi="bn-BD"/>
+                    </w:rPr>
+                    <w:t>NV</w:t>
+                  </w:r>
+                </w:p>
+              </w:tc>
+              <w:tc>
+                <w:tcPr>
+                  <w:tcW w:w="0" w:type="auto"/>
+                  <w:hideMark/>
+                </w:tcPr>
+                <w:p>
+                  <w:pPr>
+                    <w:jc w:val="center"/>
+                    <w:rPr>
+                      <w:rFonts w:eastAsia="Times New Roman"/>
+                      <w:b/>
+                      <w:bCs/>
+                      <w:lang w:bidi="bn-BD"/>
+                    </w:rPr>
+                  </w:pPr>
+                  <w:r>
+                    <w:rPr>
+                      <w:rFonts w:eastAsia="Times New Roman"/>
+                      <w:b/>
+                      <w:bCs/>
+                      <w:lang w:bidi="bn-BD"/>
+                    </w:rPr>
+                    <w:t>BCC</w:t>
+                  </w:r>
+                </w:p>
+              </w:tc>
+              <w:tc>
+                <w:tcPr>
+                  <w:tcW w:w="0" w:type="auto"/>
+                  <w:hideMark/>
+                </w:tcPr>
+                <w:p>
+                  <w:pPr>
+                    <w:jc w:val="center"/>
+                    <w:rPr>
+                      <w:rFonts w:eastAsia="Times New Roman"/>
+                      <w:b/>
+                      <w:bCs/>
+                      <w:lang w:bidi="bn-BD"/>
+                    </w:rPr>
+                  </w:pPr>
+                  <w:r>
+                    <w:rPr>
+                      <w:rFonts w:eastAsia="Times New Roman"/>
+                      <w:b/>
+                      <w:bCs/>
+                      <w:lang w:bidi="bn-BD"/>
+                    </w:rPr>
+                    <w:t>AKIEC</w:t>
+                  </w:r>
+                </w:p>
+              </w:tc>
+              <w:tc>
+                <w:tcPr>
+                  <w:tcW w:w="0" w:type="auto"/>
+                  <w:hideMark/>
+                </w:tcPr>
+                <w:p>
+                  <w:pPr>
+                    <w:jc w:val="center"/>
+                    <w:rPr>
+                      <w:rFonts w:eastAsia="Times New Roman"/>
+                      <w:b/>
+                      <w:bCs/>
+                      <w:lang w:bidi="bn-BD"/>
+                    </w:rPr>
+                  </w:pPr>
+                  <w:r>
+                    <w:rPr>
+                      <w:rFonts w:eastAsia="Times New Roman"/>
+                      <w:b/>
+                      <w:bCs/>
+                      <w:lang w:bidi="bn-BD"/>
+                    </w:rPr>
+                    <w:t>BKL</w:t>
+                  </w:r>
+                </w:p>
+              </w:tc>
+              <w:tc>
+                <w:tcPr>
+                  <w:tcW w:w="0" w:type="auto"/>
+                  <w:hideMark/>
+                </w:tcPr>
+                <w:p>
+                  <w:pPr>
+                    <w:jc w:val="center"/>
+                    <w:rPr>
+                      <w:rFonts w:eastAsia="Times New Roman"/>
+                      <w:b/>
+                      <w:bCs/>
+                      <w:lang w:bidi="bn-BD"/>
+                    </w:rPr>
+                  </w:pPr>
+                  <w:r>
+                    <w:rPr>
+                      <w:rFonts w:eastAsia="Times New Roman"/>
+                      <w:b/>
+                      <w:bCs/>
+                      <w:lang w:bidi="bn-BD"/>
+                    </w:rPr>
+                    <w:t>DF</w:t>
+                  </w:r>
+                </w:p>
+              </w:tc>
+              <w:tc>
+                <w:tcPr>
+                  <w:tcW w:w="0" w:type="auto"/>
+                  <w:hideMark/>
+                </w:tcPr>
+                <w:p>
+                  <w:pPr>
+                    <w:jc w:val="center"/>
+                    <w:rPr>
+                      <w:rFonts w:eastAsia="Times New Roman"/>
+                      <w:b/>
+                      <w:bCs/>
+                      <w:lang w:bidi="bn-BD"/>
+                    </w:rPr>
+                  </w:pPr>
+                  <w:r>
+                    <w:rPr>
+                      <w:rFonts w:eastAsia="Times New Roman"/>
+                      <w:b/>
+                      <w:bCs/>
+                      <w:lang w:bidi="bn-BD"/>
+                    </w:rPr>
+                    <w:t>VASC</w:t>
+                  </w:r>
+                </w:p>
+              </w:tc>
+            </w:tr>
+            <w:tr>
+              <w:tc>
+                <w:tcPr>
+                  <w:tcW w:w="1678" w:type="dxa"/>
+                  <w:hideMark/>
+                </w:tcPr>
+                <w:p>
+                  <w:pPr>
+                    <w:rPr>
+                      <w:rFonts w:eastAsia="Times New Roman"/>
+                      <w:lang w:bidi="bn-BD"/>
+                    </w:rPr>
+                  </w:pPr>
+                  <w:r>
+                    <w:rPr>
+                      <w:rFonts w:eastAsia="Times New Roman"/>
+                      <w:lang w:bidi="bn-BD"/>
+                    </w:rPr>
+                    <w:t>Before-</w:t>
+                  </w:r>
+                  <w:r>
+                    <w:rPr>
+                      <w:rFonts w:eastAsia="Times New Roman"/>
+                      <w:lang w:bidi="bn-BD"/>
+                    </w:rPr>
+                    <w:t>no aug</w:t>
+                  </w:r>
+                </w:p>
+              </w:tc>
+              <w:tc>
+                <w:tcPr>
+                  <w:tcW w:w="871" w:type="dxa"/>
+                  <w:hideMark/>
+                </w:tcPr>
+                <w:p>
+                  <w:pPr>
+                    <w:rPr>
+                      <w:rFonts w:eastAsia="Times New Roman"/>
+                      <w:lang w:bidi="bn-BD"/>
+                    </w:rPr>
+                  </w:pPr>
+                  <w:r>
+                    <w:rPr>
+                      <w:rFonts w:eastAsia="Times New Roman"/>
+                      <w:lang w:bidi="bn-BD"/>
+                    </w:rPr>
+                    <w:t>0.730</w:t>
+                  </w:r>
+                </w:p>
+              </w:tc>
+              <w:tc>
+                <w:tcPr>
+                  <w:tcW w:w="0" w:type="auto"/>
+                  <w:hideMark/>
+                </w:tcPr>
+                <w:p>
+                  <w:pPr>
+                    <w:rPr>
+                      <w:rFonts w:eastAsia="Times New Roman"/>
+                      <w:lang w:bidi="bn-BD"/>
+                    </w:rPr>
+                  </w:pPr>
+                  <w:r>
+                    <w:rPr>
+                      <w:rFonts w:eastAsia="Times New Roman"/>
+                      <w:lang w:bidi="bn-BD"/>
+                    </w:rPr>
+                    <w:t>0.529</w:t>
+                  </w:r>
+                </w:p>
+              </w:tc>
+              <w:tc>
+                <w:tcPr>
+                  <w:tcW w:w="0" w:type="auto"/>
+                  <w:hideMark/>
+                </w:tcPr>
+                <w:p>
+                  <w:pPr>
+                    <w:rPr>
+                      <w:rFonts w:eastAsia="Times New Roman"/>
+                      <w:lang w:bidi="bn-BD"/>
+                    </w:rPr>
+                  </w:pPr>
+                  <w:r>
+                    <w:rPr>
+                      <w:rFonts w:eastAsia="Times New Roman"/>
+                      <w:lang w:bidi="bn-BD"/>
+                    </w:rPr>
+                    <w:t>0.375</w:t>
+                  </w:r>
+                </w:p>
+              </w:tc>
+              <w:tc>
+                <w:tcPr>
+                  <w:tcW w:w="0" w:type="auto"/>
+                  <w:hideMark/>
+                </w:tcPr>
+                <w:p>
+                  <w:pPr>
+                    <w:rPr>
+                      <w:rFonts w:eastAsia="Times New Roman"/>
+                      <w:lang w:bidi="bn-BD"/>
+                    </w:rPr>
+                  </w:pPr>
+                  <w:r>
+                    <w:rPr>
+                      <w:rFonts w:eastAsia="Times New Roman"/>
+                      <w:lang w:bidi="bn-BD"/>
+                    </w:rPr>
+                    <w:t>0.840</w:t>
+                  </w:r>
+                </w:p>
+              </w:tc>
+              <w:tc>
+                <w:tcPr>
+                  <w:tcW w:w="0" w:type="auto"/>
+                  <w:hideMark/>
+                </w:tcPr>
+                <w:p>
+                  <w:pPr>
+                    <w:rPr>
+                      <w:rFonts w:eastAsia="Times New Roman"/>
+                      <w:lang w:bidi="bn-BD"/>
+                    </w:rPr>
+                  </w:pPr>
+                  <w:r>
+                    <w:rPr>
+                      <w:rFonts w:eastAsia="Times New Roman"/>
+                      <w:lang w:bidi="bn-BD"/>
+                    </w:rPr>
+                    <w:t>0.571</w:t>
+                  </w:r>
+                </w:p>
+              </w:tc>
+              <w:tc>
+                <w:tcPr>
+                  <w:tcW w:w="0" w:type="auto"/>
+                  <w:hideMark/>
+                </w:tcPr>
+                <w:p>
+                  <w:pPr>
+                    <w:rPr>
+                      <w:rFonts w:eastAsia="Times New Roman"/>
+                      <w:lang w:bidi="bn-BD"/>
+                    </w:rPr>
+                  </w:pPr>
+                  <w:r>
+                    <w:rPr>
+                      <w:rFonts w:eastAsia="Times New Roman"/>
+                      <w:lang w:bidi="bn-BD"/>
+                    </w:rPr>
+                    <w:t>0.389</w:t>
+                  </w:r>
+                </w:p>
+              </w:tc>
+              <w:tc>
+                <w:tcPr>
+                  <w:tcW w:w="0" w:type="auto"/>
+                  <w:hideMark/>
+                </w:tcPr>
+                <w:p>
+                  <w:pPr>
+                    <w:rPr>
+                      <w:rFonts w:eastAsia="Times New Roman"/>
+                      <w:lang w:bidi="bn-BD"/>
+                    </w:rPr>
+                  </w:pPr>
+                  <w:r>
+                    <w:rPr>
+                      <w:rFonts w:eastAsia="Times New Roman"/>
+                      <w:lang w:bidi="bn-BD"/>
+                    </w:rPr>
+                    <w:t>0.526</w:t>
+                  </w:r>
+                </w:p>
+              </w:tc>
+              <w:tc>
+                <w:tcPr>
+                  <w:tcW w:w="0" w:type="auto"/>
+                  <w:hideMark/>
+                </w:tcPr>
+                <w:p>
+                  <w:pPr>
+                    <w:rPr>
+                      <w:rFonts w:eastAsia="Times New Roman"/>
+                      <w:lang w:bidi="bn-BD"/>
+                    </w:rPr>
+                  </w:pPr>
+                  <w:r>
+                    <w:rPr>
+                      <w:rFonts w:eastAsia="Times New Roman"/>
+                      <w:lang w:bidi="bn-BD"/>
+                    </w:rPr>
+                    <w:t>0.00</w:t>
+                  </w:r>
+                </w:p>
+              </w:tc>
+              <w:tc>
+                <w:tcPr>
+                  <w:tcW w:w="0" w:type="auto"/>
+                  <w:hideMark/>
+                </w:tcPr>
+                <w:p>
+                  <w:pPr>
+                    <w:rPr>
+                      <w:rFonts w:eastAsia="Times New Roman"/>
+                      <w:lang w:bidi="bn-BD"/>
+                    </w:rPr>
+                  </w:pPr>
+                  <w:r>
+                    <w:rPr>
+                      <w:rFonts w:eastAsia="Times New Roman"/>
+                      <w:lang w:bidi="bn-BD"/>
+                    </w:rPr>
+                    <w:t>1.00</w:t>
+                  </w:r>
+                </w:p>
+              </w:tc>
+            </w:tr>
+            <w:tr>
+              <w:tc>
+                <w:tcPr>
+                  <w:tcW w:w="1678" w:type="dxa"/>
+                  <w:hideMark/>
+                </w:tcPr>
+                <w:p>
+                  <w:pPr>
+                    <w:rPr>
+                      <w:rFonts w:eastAsia="Times New Roman"/>
+                      <w:lang w:bidi="bn-BD"/>
+                    </w:rPr>
+                  </w:pPr>
+                  <w:r>
+                    <w:rPr>
+                      <w:rFonts w:eastAsia="Times New Roman"/>
+                      <w:lang w:bidi="bn-BD"/>
+                    </w:rPr>
+                    <w:t>A — hflip only</w:t>
+                  </w:r>
+                </w:p>
+              </w:tc>
+              <w:tc>
+                <w:tcPr>
+                  <w:tcW w:w="871" w:type="dxa"/>
+                  <w:hideMark/>
+                </w:tcPr>
+                <w:p>
+                  <w:pPr>
+                    <w:rPr>
+                      <w:rFonts w:eastAsia="Times New Roman"/>
+                      <w:lang w:bidi="bn-BD"/>
+                    </w:rPr>
+                  </w:pPr>
+                  <w:r>
+                    <w:rPr>
+                      <w:rFonts w:eastAsia="Times New Roman"/>
+                      <w:lang w:bidi="bn-BD"/>
+                    </w:rPr>
+                    <w:t>0.692</w:t>
+                  </w:r>
+                </w:p>
+              </w:tc>
+              <w:tc>
+                <w:tcPr>
+                  <w:tcW w:w="0" w:type="auto"/>
+                  <w:hideMark/>
+                </w:tcPr>
+                <w:p>
+                  <w:pPr>
+                    <w:rPr>
+                      <w:rFonts w:eastAsia="Times New Roman"/>
+                      <w:lang w:bidi="bn-BD"/>
+                    </w:rPr>
+                  </w:pPr>
+                  <w:r>
+                    <w:rPr>
+                      <w:rFonts w:eastAsia="Times New Roman"/>
+                      <w:lang w:bidi="bn-BD"/>
+                    </w:rPr>
+                    <w:t>0.586</w:t>
+                  </w:r>
+                </w:p>
+              </w:tc>
+              <w:tc>
+                <w:tcPr>
+                  <w:tcW w:w="0" w:type="auto"/>
+                  <w:hideMark/>
+                </w:tcPr>
+                <w:p>
+                  <w:pPr>
+                    <w:rPr>
+                      <w:rFonts w:eastAsia="Times New Roman"/>
+                      <w:lang w:bidi="bn-BD"/>
+                    </w:rPr>
+                  </w:pPr>
+                  <w:r>
+                    <w:rPr>
+                      <w:rFonts w:eastAsia="Times New Roman"/>
+                      <w:lang w:bidi="bn-BD"/>
+                    </w:rPr>
+                    <w:t>0.531</w:t>
+                  </w:r>
+                </w:p>
+              </w:tc>
+              <w:tc>
+                <w:tcPr>
+                  <w:tcW w:w="0" w:type="auto"/>
+                  <w:hideMark/>
+                </w:tcPr>
+                <w:p>
+                  <w:pPr>
+                    <w:rPr>
+                      <w:rFonts w:eastAsia="Times New Roman"/>
+                      <w:lang w:bidi="bn-BD"/>
+                    </w:rPr>
+                  </w:pPr>
+                  <w:r>
+                    <w:rPr>
+                      <w:rFonts w:eastAsia="Times New Roman"/>
+                      <w:lang w:bidi="bn-BD"/>
+                    </w:rPr>
+                    <w:t>0.776</w:t>
+                  </w:r>
+                </w:p>
+              </w:tc>
+              <w:tc>
+                <w:tcPr>
+                  <w:tcW w:w="0" w:type="auto"/>
+                  <w:hideMark/>
+                </w:tcPr>
+                <w:p>
+                  <w:pPr>
+                    <w:rPr>
+                      <w:rFonts w:eastAsia="Times New Roman"/>
+                      <w:lang w:bidi="bn-BD"/>
+                    </w:rPr>
+                  </w:pPr>
+                  <w:r>
+                    <w:rPr>
+                      <w:rFonts w:eastAsia="Times New Roman"/>
+                      <w:lang w:bidi="bn-BD"/>
+                    </w:rPr>
+                    <w:t>0.667</w:t>
+                  </w:r>
+                </w:p>
+              </w:tc>
+              <w:tc>
+                <w:tcPr>
+                  <w:tcW w:w="0" w:type="auto"/>
+                  <w:hideMark/>
+                </w:tcPr>
+                <w:p>
+                  <w:pPr>
+                    <w:rPr>
+                      <w:rFonts w:eastAsia="Times New Roman"/>
+                      <w:lang w:bidi="bn-BD"/>
+                    </w:rPr>
+                  </w:pPr>
+                  <w:r>
+                    <w:rPr>
+                      <w:rFonts w:eastAsia="Times New Roman"/>
+                      <w:lang w:bidi="bn-BD"/>
+                    </w:rPr>
+                    <w:t>0.667</w:t>
+                  </w:r>
+                </w:p>
+              </w:tc>
+              <w:tc>
+                <w:tcPr>
+                  <w:tcW w:w="0" w:type="auto"/>
+                  <w:hideMark/>
+                </w:tcPr>
+                <w:p>
+                  <w:pPr>
+                    <w:rPr>
+                      <w:rFonts w:eastAsia="Times New Roman"/>
+                      <w:lang w:bidi="bn-BD"/>
+                    </w:rPr>
+                  </w:pPr>
+                  <w:r>
+                    <w:rPr>
+                      <w:rFonts w:eastAsia="Times New Roman"/>
+                      <w:lang w:bidi="bn-BD"/>
+                    </w:rPr>
+                    <w:t>0.263</w:t>
+                  </w:r>
+                </w:p>
+              </w:tc>
+              <w:tc>
+                <w:tcPr>
+                  <w:tcW w:w="0" w:type="auto"/>
+                  <w:hideMark/>
+                </w:tcPr>
+                <w:p>
+                  <w:pPr>
+                    <w:rPr>
+                      <w:rFonts w:eastAsia="Times New Roman"/>
+                      <w:lang w:bidi="bn-BD"/>
+                    </w:rPr>
+                  </w:pPr>
+                  <w:r>
+                    <w:rPr>
+                      <w:rFonts w:eastAsia="Times New Roman"/>
+                      <w:lang w:bidi="bn-BD"/>
+                    </w:rPr>
+                    <w:t>0.20</w:t>
+                  </w:r>
+                </w:p>
+              </w:tc>
+              <w:tc>
+                <w:tcPr>
+                  <w:tcW w:w="0" w:type="auto"/>
+                  <w:hideMark/>
+                </w:tcPr>
+                <w:p>
+                  <w:pPr>
+                    <w:rPr>
+                      <w:rFonts w:eastAsia="Times New Roman"/>
+                      <w:lang w:bidi="bn-BD"/>
+                    </w:rPr>
+                  </w:pPr>
+                  <w:r>
+                    <w:rPr>
+                      <w:rFonts w:eastAsia="Times New Roman"/>
+                      <w:lang w:bidi="bn-BD"/>
+                    </w:rPr>
+                    <w:t>1.00</w:t>
+                  </w:r>
+                </w:p>
+              </w:tc>
+            </w:tr>
+            <w:tr>
+              <w:tc>
+                <w:tcPr>
+                  <w:tcW w:w="1678" w:type="dxa"/>
+                  <w:hideMark/>
+                </w:tcPr>
+                <w:p>
+                  <w:pPr>
+                    <w:rPr>
+                      <w:rFonts w:eastAsia="Times New Roman"/>
+                      <w:lang w:bidi="bn-BD"/>
+                    </w:rPr>
+                  </w:pPr>
+                  <w:r>
+                    <w:rPr>
+                      <w:rFonts w:eastAsia="Times New Roman"/>
+                      <w:lang w:bidi="bn-BD"/>
+                    </w:rPr>
+                    <w:t>B — full aug</w:t>
+                  </w:r>
+                </w:p>
+              </w:tc>
+              <w:tc>
+                <w:tcPr>
+                  <w:tcW w:w="871" w:type="dxa"/>
+                  <w:hideMark/>
+                </w:tcPr>
+                <w:p>
+                  <w:pPr>
+                    <w:rPr>
+                      <w:rFonts w:eastAsia="Times New Roman"/>
+                      <w:lang w:bidi="bn-BD"/>
+                    </w:rPr>
+                  </w:pPr>
+                  <w:r>
+                    <w:rPr>
+                      <w:rFonts w:eastAsia="Times New Roman"/>
+                      <w:lang w:bidi="bn-BD"/>
+                    </w:rPr>
+                    <w:t>0.533</w:t>
+                  </w:r>
+                </w:p>
+              </w:tc>
+              <w:tc>
+                <w:tcPr>
+                  <w:tcW w:w="0" w:type="auto"/>
+                  <w:hideMark/>
+                </w:tcPr>
+                <w:p>
+                  <w:pPr>
+                    <w:rPr>
+                      <w:rFonts w:eastAsia="Times New Roman"/>
+                      <w:lang w:bidi="bn-BD"/>
+                    </w:rPr>
+                  </w:pPr>
+                  <w:r>
+                    <w:rPr>
+                      <w:rFonts w:eastAsia="Times New Roman"/>
+                      <w:lang w:bidi="bn-BD"/>
+                    </w:rPr>
+                    <w:t>0.477</w:t>
+                  </w:r>
+                </w:p>
+              </w:tc>
+              <w:tc>
+                <w:tcPr>
+                  <w:tcW w:w="0" w:type="auto"/>
+                  <w:hideMark/>
+                </w:tcPr>
+                <w:p>
+                  <w:pPr>
+                    <w:rPr>
+                      <w:rFonts w:eastAsia="Times New Roman"/>
+                      <w:lang w:bidi="bn-BD"/>
+                    </w:rPr>
+                  </w:pPr>
+                  <w:r>
+                    <w:rPr>
+                      <w:rFonts w:eastAsia="Times New Roman"/>
+                      <w:lang w:bidi="bn-BD"/>
+                    </w:rPr>
+                    <w:t>0.406</w:t>
+                  </w:r>
+                </w:p>
+              </w:tc>
+              <w:tc>
+                <w:tcPr>
+                  <w:tcW w:w="0" w:type="auto"/>
+                  <w:hideMark/>
+                </w:tcPr>
+                <w:p>
+                  <w:pPr>
+                    <w:rPr>
+                      <w:rFonts w:eastAsia="Times New Roman"/>
+                      <w:lang w:bidi="bn-BD"/>
+                    </w:rPr>
+                  </w:pPr>
+                  <w:r>
+                    <w:rPr>
+                      <w:rFonts w:eastAsia="Times New Roman"/>
+                      <w:lang w:bidi="bn-BD"/>
+                    </w:rPr>
+                    <w:t>0.601</w:t>
+                  </w:r>
+                </w:p>
+              </w:tc>
+              <w:tc>
+                <w:tcPr>
+                  <w:tcW w:w="0" w:type="auto"/>
+                  <w:hideMark/>
+                </w:tcPr>
+                <w:p>
+                  <w:pPr>
+                    <w:rPr>
+                      <w:rFonts w:eastAsia="Times New Roman"/>
+                      <w:lang w:bidi="bn-BD"/>
+                    </w:rPr>
+                  </w:pPr>
+                  <w:r>
+                    <w:rPr>
+                      <w:rFonts w:eastAsia="Times New Roman"/>
+                      <w:lang w:bidi="bn-BD"/>
+                    </w:rPr>
+                    <w:t>0.333</w:t>
+                  </w:r>
+                </w:p>
+              </w:tc>
+              <w:tc>
+                <w:tcPr>
+                  <w:tcW w:w="0" w:type="auto"/>
+                  <w:hideMark/>
+                </w:tcPr>
+                <w:p>
+                  <w:pPr>
+                    <w:rPr>
+                      <w:rFonts w:eastAsia="Times New Roman"/>
+                      <w:lang w:bidi="bn-BD"/>
+                    </w:rPr>
+                  </w:pPr>
+                  <w:r>
+                    <w:rPr>
+                      <w:rFonts w:eastAsia="Times New Roman"/>
+                      <w:lang w:bidi="bn-BD"/>
+                    </w:rPr>
+                    <w:t>0.944</w:t>
+                  </w:r>
+                </w:p>
+              </w:tc>
+              <w:tc>
+                <w:tcPr>
+                  <w:tcW w:w="0" w:type="auto"/>
+                  <w:hideMark/>
+                </w:tcPr>
+                <w:p>
+                  <w:pPr>
+                    <w:rPr>
+                      <w:rFonts w:eastAsia="Times New Roman"/>
+                      <w:lang w:bidi="bn-BD"/>
+                    </w:rPr>
+                  </w:pPr>
+                  <w:r>
+                    <w:rPr>
+                      <w:rFonts w:eastAsia="Times New Roman"/>
+                      <w:lang w:bidi="bn-BD"/>
+                    </w:rPr>
+                    <w:t>0.053</w:t>
+                  </w:r>
+                </w:p>
+              </w:tc>
+              <w:tc>
+                <w:tcPr>
+                  <w:tcW w:w="0" w:type="auto"/>
+                  <w:hideMark/>
+                </w:tcPr>
+                <w:p>
+                  <w:pPr>
+                    <w:rPr>
+                      <w:rFonts w:eastAsia="Times New Roman"/>
+                      <w:lang w:bidi="bn-BD"/>
+                    </w:rPr>
+                  </w:pPr>
+                  <w:r>
+                    <w:rPr>
+                      <w:rFonts w:eastAsia="Times New Roman"/>
+                      <w:lang w:bidi="bn-BD"/>
+                    </w:rPr>
+                    <w:t>0.20</w:t>
+                  </w:r>
+                </w:p>
+              </w:tc>
+              <w:tc>
+                <w:tcPr>
+                  <w:tcW w:w="0" w:type="auto"/>
+                  <w:hideMark/>
+                </w:tcPr>
+                <w:p>
+                  <w:pPr>
+                    <w:rPr>
+                      <w:rFonts w:eastAsia="Times New Roman"/>
+                      <w:lang w:bidi="bn-BD"/>
+                    </w:rPr>
+                  </w:pPr>
+                  <w:r>
+                    <w:rPr>
+                      <w:rFonts w:eastAsia="Times New Roman"/>
+                      <w:lang w:bidi="bn-BD"/>
+                    </w:rPr>
+                    <w:t>0.80</w:t>
+                  </w:r>
+                </w:p>
+              </w:tc>
+            </w:tr>
+          </w:tbl>
+          <w:p>
+            <w:pPr>
+              <w:spacing w:after="80"/>
+            </w:pPr>
+          </w:p>
+          <w:p>
+            <w:pPr>
+              <w:spacing w:after="80"/>
+            </w:pPr>
+            <w:r>
+              <w:rPr>
+                <w:noProof/>
+              </w:rPr>
+              <w:drawing>
+                <wp:inline distT="0" distB="0" distL="0" distR="0" wp14:anchorId="3BA39F6C" wp14:editId="0F27BF6A">
+                  <wp:extent cx="3898900" cy="3492763"/>
+                  <wp:effectExtent l="0" t="0" r="6350" b="0"/>
+                  <wp:docPr id="1548515775" name="Picture 4"/>
+                  <wp:cNvGraphicFramePr>
+                    <a:graphicFrameLocks xmlns:a="http://schemas.openxmlformats.org/drawingml/2006/main" noChangeAspect="1"/>
+                  </wp:cNvGraphicFramePr>
+                  <a:graphic xmlns:a="http://schemas.openxmlformats.org/drawingml/2006/main">
+                    <a:graphicData uri="http://schemas.openxmlformats.org/drawingml/2006/picture">
+                      <pic:pic xmlns:pic="http://schemas.openxmlformats.org/drawingml/2006/picture">
+                        <pic:nvPicPr>
+                          <pic:cNvPr id="1548515775" name="Picture 1548515775"/>
+                          <pic:cNvPicPr/>
+                        </pic:nvPicPr>
+                        <pic:blipFill>
+                          <a:blip r:embed="rId7">
+                            <a:extLst>
+                              <a:ext uri="{28A0092B-C50C-407E-A947-70E740481C1C}">
+                                <a14:useLocalDpi xmlns:a14="http://schemas.microsoft.com/office/drawing/2010/main" val="0"/>
+                              </a:ext>
+                            </a:extLst>
+                          </a:blip>
+                          <a:stretch>
+                            <a:fillRect/>
+                          </a:stretch>
+                        </pic:blipFill>
+                        <pic:spPr>
+                          <a:xfrm>
+                            <a:off x="0" y="0"/>
+                            <a:ext cx="3926153" cy="3517177"/>
+                          </a:xfrm>
+                          <a:prstGeom prst="rect">
+                            <a:avLst/>
+                          </a:prstGeom>
+                        </pic:spPr>
+                      </pic:pic>
+                    </a:graphicData>
+                  </a:graphic>
+                </wp:inline>
+              </w:drawing>
+            </w:r>
+          </w:p>
+          <w:p/>
+          <w:p>
+            <w:r>
+              <w:rPr>
+                <w:noProof/>
+              </w:rPr>
+              <w:drawing>
+                <wp:inline distT="0" distB="0" distL="0" distR="0" wp14:anchorId="412DC262" wp14:editId="0B53D591">
+                  <wp:extent cx="4064000" cy="3640666"/>
+                  <wp:effectExtent l="0" t="0" r="0" b="0"/>
+                  <wp:docPr id="1904649515" name="Picture 5"/>
+                  <wp:cNvGraphicFramePr>
+                    <a:graphicFrameLocks xmlns:a="http://schemas.openxmlformats.org/drawingml/2006/main" noChangeAspect="1"/>
+                  </wp:cNvGraphicFramePr>
+                  <a:graphic xmlns:a="http://schemas.openxmlformats.org/drawingml/2006/main">
+                    <a:graphicData uri="http://schemas.openxmlformats.org/drawingml/2006/picture">
+                      <pic:pic xmlns:pic="http://schemas.openxmlformats.org/drawingml/2006/picture">
+                        <pic:nvPicPr>
+                          <pic:cNvPr id="1904649515" name="Picture 1904649515"/>
+                          <pic:cNvPicPr/>
+                        </pic:nvPicPr>
+                        <pic:blipFill>
+                          <a:blip r:embed="rId8">
+                            <a:extLst>
+                              <a:ext uri="{28A0092B-C50C-407E-A947-70E740481C1C}">
+                                <a14:useLocalDpi xmlns:a14="http://schemas.microsoft.com/office/drawing/2010/main" val="0"/>
+                              </a:ext>
+                            </a:extLst>
+                          </a:blip>
+                          <a:stretch>
+                            <a:fillRect/>
+                          </a:stretch>
+                        </pic:blipFill>
+                        <pic:spPr>
+                          <a:xfrm>
+                            <a:off x="0" y="0"/>
+                            <a:ext cx="4074621" cy="3650181"/>
+                          </a:xfrm>
+                          <a:prstGeom prst="rect">
+                            <a:avLst/>
+                          </a:prstGeom>
+                        </pic:spPr>
+                      </pic:pic>
+                    </a:graphicData>
+                  </a:graphic>
+                </wp:inline>
+              </w:drawing>
+            </w:r>
+          </w:p>
+          <w:p/>
+          <w:p>
+            <w:r>
+              <w:rPr>
+                <w:noProof/>
+              </w:rPr>
+              <w:drawing>
+                <wp:inline distT="0" distB="0" distL="0" distR="0" wp14:anchorId="434920AA" wp14:editId="4CBD7C6B">
+                  <wp:extent cx="4064000" cy="3635456"/>
+                  <wp:effectExtent l="0" t="0" r="0" b="3175"/>
+                  <wp:docPr id="605048664" name="Picture 6"/>
+                  <wp:cNvGraphicFramePr>
+                    <a:graphicFrameLocks xmlns:a="http://schemas.openxmlformats.org/drawingml/2006/main" noChangeAspect="1"/>
+                  </wp:cNvGraphicFramePr>
+                  <a:graphic xmlns:a="http://schemas.openxmlformats.org/drawingml/2006/main">
+                    <a:graphicData uri="http://schemas.openxmlformats.org/drawingml/2006/picture">
+                      <pic:pic xmlns:pic="http://schemas.openxmlformats.org/drawingml/2006/picture">
+                        <pic:nvPicPr>
+                          <pic:cNvPr id="605048664" name="Picture 605048664"/>
+                          <pic:cNvPicPr/>
+                        </pic:nvPicPr>
+                        <pic:blipFill>
+                          <a:blip r:embed="rId9">
+                            <a:extLst>
+                              <a:ext uri="{28A0092B-C50C-407E-A947-70E740481C1C}">
+                                <a14:useLocalDpi xmlns:a14="http://schemas.microsoft.com/office/drawing/2010/main" val="0"/>
+                              </a:ext>
+                            </a:extLst>
+                          </a:blip>
+                          <a:stretch>
+                            <a:fillRect/>
+                          </a:stretch>
+                        </pic:blipFill>
+                        <pic:spPr>
+                          <a:xfrm>
+                            <a:off x="0" y="0"/>
+                            <a:ext cx="4072808" cy="3643335"/>
+                          </a:xfrm>
+                          <a:prstGeom prst="rect">
+                            <a:avLst/>
+                          </a:prstGeom>
+                        </pic:spPr>
+                      </pic:pic>
+                    </a:graphicData>
+                  </a:graphic>
+                </wp:inline>
+              </w:drawing>
+            </w:r>
+          </w:p>
+          <w:p/>
         </w:tc>
       </w:tr>
     </w:tbl>
@@ -1848,7 +4687,6 @@
                 <w:iCs/>
                 <w:color w:val="666666"/>
               </w:rPr>
-              <w:lastRenderedPageBreak/>
               <w:t>Insert your answer here</w:t>
             </w:r>
           </w:p>
@@ -2456,7 +5294,6 @@
   <w:style w:type="character" w:default="1" w:styleId="DefaultParagraphFont">
     <w:name w:val="Default Paragraph Font"/>
     <w:uiPriority w:val="1"/>
-    <w:semiHidden/>
     <w:unhideWhenUsed/>
   </w:style>
   <w:style w:type="table" w:default="1" w:styleId="TableNormal">
@@ -2571,6 +5408,43 @@
       <w:sz w:val="20"/>
       <w:szCs w:val="20"/>
     </w:rPr>
+  </w:style>
+  <w:style w:type="paragraph" w:styleId="Subtitle">
+    <w:name w:val="Subtitle"/>
+    <w:basedOn w:val="Normal"/>
+    <w:next w:val="Normal"/>
+    <w:uiPriority w:val="11"/>
+    <w:qFormat/>
+    <w:rsid w:val="00B72667"/>
+    <w:pPr>
+      <w:numPr>
+        <w:ilvl w:val="1"/>
+      </w:numPr>
+      <w:spacing w:after="160"/>
+    </w:pPr>
+    <w:rPr>
+      <w:rFonts w:asciiTheme="minorHAnsi" w:eastAsiaTheme="majorEastAsia" w:hAnsiTheme="minorHAnsi" w:cstheme="majorBidi"/>
+      <w:color w:val="595959" w:themeColor="text1" w:themeTint="A6"/>
+      <w:spacing w:val="15"/>
+      <w:sz w:val="28"/>
+      <w:szCs w:val="28"/>
+    </w:rPr>
+  </w:style>
+  <w:style w:type="table" w:styleId="TableGrid">
+    <w:name w:val="Table Grid"/>
+    <w:basedOn w:val="TableNormal"/>
+    <w:uiPriority w:val="39"/>
+    <w:rsid w:val="003F67E8"/>
+    <w:tblPr>
+      <w:tblBorders>
+        <w:top w:val="single" w:sz="4" w:space="0" w:color="auto"/>
+        <w:left w:val="single" w:sz="4" w:space="0" w:color="auto"/>
+        <w:bottom w:val="single" w:sz="4" w:space="0" w:color="auto"/>
+        <w:right w:val="single" w:sz="4" w:space="0" w:color="auto"/>
+        <w:insideH w:val="single" w:sz="4" w:space="0" w:color="auto"/>
+        <w:insideV w:val="single" w:sz="4" w:space="0" w:color="auto"/>
+      </w:tblBorders>
+    </w:tblPr>
   </w:style>
 </w:styles>
 </file>

</xml_diff>

<commit_message>
Finished and Added Task 1g Model Training Master Cell
</commit_message>
<xml_diff>
--- a/Assessment/CSE3001_Assignment_Report.docx
+++ b/Assessment/CSE3001_Assignment_Report.docx
@@ -888,11 +888,6 @@
           </w:p>
           <w:p>
             <w:pPr>
-              <w:spacing w:after="80"/>
-            </w:pPr>
-          </w:p>
-          <w:p>
-            <w:pPr>
               <w:spacing w:after="200"/>
               <w:jc w:val="center"/>
               <w:rPr>
@@ -955,13 +950,25 @@
             <w:pPr>
               <w:spacing w:after="200"/>
               <w:rPr>
-                <w:i/>
-                <w:iCs/>
-                <w:color w:val="666666"/>
-              </w:rPr>
-            </w:pPr>
-            <w:r>
-              <w:rPr>
+                <w:b/>
+                <w:bCs/>
+                <w:i/>
+                <w:iCs/>
+                <w:color w:val="666666"/>
+              </w:rPr>
+            </w:pPr>
+            <w:r>
+              <w:rPr>
+                <w:i/>
+                <w:iCs/>
+                <w:color w:val="666666"/>
+              </w:rPr>
+              <w:br/>
+            </w:r>
+            <w:r>
+              <w:rPr>
+                <w:b/>
+                <w:bCs/>
                 <w:i/>
                 <w:iCs/>
                 <w:color w:val="666666"/>
@@ -1407,6 +1414,15 @@
               </w:tc>
             </w:tr>
           </w:tbl>
+          <w:p>
+            <w:pPr>
+              <w:spacing w:after="80"/>
+              <w:rPr>
+                <w:b/>
+                <w:bCs/>
+              </w:rPr>
+            </w:pPr>
+          </w:p>
           <w:p>
             <w:pPr>
               <w:spacing w:after="80"/>
@@ -4315,7 +4331,8 @@
     </w:p>
     <w:tbl>
       <w:tblPr>
-        <w:tblW w:w="9360" w:type="dxa"/>
+        <w:tblW w:w="10207" w:type="dxa"/>
+        <w:tblInd w:w="-436" w:type="dxa"/>
         <w:tblBorders>
           <w:top w:val="single" w:sz="4" w:space="0" w:color="auto"/>
           <w:left w:val="single" w:sz="4" w:space="0" w:color="auto"/>
@@ -4331,12 +4348,12 @@
         <w:tblLook w:val="04A0" w:firstRow="1" w:lastRow="0" w:firstColumn="1" w:lastColumn="0" w:noHBand="0" w:noVBand="1"/>
       </w:tblPr>
       <w:tblGrid>
-        <w:gridCol w:w="9360"/>
+        <w:gridCol w:w="10207"/>
       </w:tblGrid>
       <w:tr>
         <w:tc>
           <w:tcPr>
-            <w:tcW w:w="9360" w:type="dxa"/>
+            <w:tcW w:w="10207" w:type="dxa"/>
             <w:tcBorders>
               <w:top w:val="single" w:sz="8" w:space="0" w:color="CCCCCC"/>
               <w:left w:val="single" w:sz="8" w:space="0" w:color="CCCCCC"/>
@@ -4513,23 +4530,7 @@
                 <w:iCs/>
                 <w:color w:val="666666"/>
               </w:rPr>
-              <w:t xml:space="preserve">The frozen model achieved the </w:t>
-            </w:r>
-            <w:r>
-              <w:rPr>
-                <w:i/>
-                <w:iCs/>
-                <w:color w:val="666666"/>
-              </w:rPr>
-              <w:t>best-balanced</w:t>
-            </w:r>
-            <w:r>
-              <w:rPr>
-                <w:i/>
-                <w:iCs/>
-                <w:color w:val="666666"/>
-              </w:rPr>
-              <w:t xml:space="preserve"> performance across all classes. The confusion matrix showed strong recall for minority classes such as AKIEC, DF, and VASC, while still maintaining reasonable performance on the majority NV class. This indicates that the pretrained ImageNet features transferred well to the skin-lesion classification task without heavily overfitting the dataset.</w:t>
+              <w:t>The frozen model achieved the best-balanced performance across all classes. The confusion matrix showed strong recall for minority classes such as AKIEC, DF, and VASC, while still maintaining reasonable performance on the majority NV class. This indicates that the pretrained ImageNet features transferred well to the skin-lesion classification task without heavily overfitting the dataset.</w:t>
             </w:r>
             <w:r>
               <w:rPr>
@@ -4567,23 +4568,7 @@
                 <w:iCs/>
                 <w:color w:val="666666"/>
               </w:rPr>
-              <w:t xml:space="preserve">A second ResNet18 model was trained by fine-tuning all layers of the network (no layers frozen). The same WeightedRandomSampler, optimizer, and training settings were used, except a smaller learning rate was applied to avoid </w:t>
-            </w:r>
-            <w:r>
-              <w:rPr>
-                <w:i/>
-                <w:iCs/>
-                <w:color w:val="666666"/>
-              </w:rPr>
-              <w:t>destabilizing</w:t>
-            </w:r>
-            <w:r>
-              <w:rPr>
-                <w:i/>
-                <w:iCs/>
-                <w:color w:val="666666"/>
-              </w:rPr>
-              <w:t xml:space="preserve"> the pretrained weights.</w:t>
+              <w:t>A second ResNet18 model was trained by fine-tuning all layers of the network (no layers frozen). The same WeightedRandomSampler, optimizer, and training settings were used, except a smaller learning rate was applied to avoid destabilizing the pretrained weights.</w:t>
             </w:r>
           </w:p>
           <w:p>
@@ -4757,14 +4742,6 @@
               </w:rPr>
               <w:t>The fine-tuned model achieved significantly higher overall validation accuracy (83.75%), but its lower UAR indicates that performance became less balanced across classes. This suggests that the model overfitted toward the dominant NV class during training. This interpretation is supported by the extremely high training accuracy and training UAR (both approximately 99%), which indicates near memorisation of the training set.</w:t>
             </w:r>
-            <w:r>
-              <w:rPr>
-                <w:i/>
-                <w:iCs/>
-                <w:color w:val="666666"/>
-              </w:rPr>
-              <w:br/>
-            </w:r>
           </w:p>
           <w:p>
             <w:pPr>
@@ -4782,15 +4759,6 @@
               </w:rPr>
               <w:t>In contrast, the frozen ResNet18 model achieved lower overall accuracy but substantially higher validation UAR (70.21%). The frozen model maintained much stronger minority-class recognition and produced more balanced classification performance overall.</w:t>
             </w:r>
-          </w:p>
-          <w:p>
-            <w:pPr>
-              <w:rPr>
-                <w:i/>
-                <w:iCs/>
-                <w:color w:val="666666"/>
-              </w:rPr>
-            </w:pPr>
           </w:p>
           <w:p>
             <w:pPr>
@@ -4814,13 +4782,9 @@
     </w:tbl>
     <w:p>
       <w:pPr>
-        <w:spacing w:after="200"/>
-      </w:pPr>
-    </w:p>
-    <w:p>
-      <w:pPr>
         <w:pStyle w:val="Heading3"/>
         <w:spacing w:before="360" w:after="200"/>
+        <w:ind w:left="-426"/>
       </w:pPr>
       <w:r>
         <w:t>Task 1g – Chase improved performance (no explicit marks for report but overall mark for this sub-task is 1</w:t>
@@ -4831,35 +4795,14 @@
       <w:r>
         <w:t>)</w:t>
       </w:r>
-    </w:p>
-    <w:p>
-      <w:pPr>
-        <w:spacing w:after="200"/>
-      </w:pPr>
       <w:r>
-        <w:rPr>
-          <w:b/>
-          <w:bCs/>
-          <w:i/>
-          <w:iCs/>
-          <w:sz w:val="20"/>
-          <w:szCs w:val="20"/>
-        </w:rPr>
-        <w:t xml:space="preserve">Note: </w:t>
-      </w:r>
-      <w:r>
-        <w:rPr>
-          <w:i/>
-          <w:iCs/>
-          <w:sz w:val="20"/>
-          <w:szCs w:val="20"/>
-        </w:rPr>
-        <w:t>Ensure all detailed runs are recorded in the accompanying Excel spreadsheet and Weights &amp; Biases report as outlined in the assignment instructions.</w:t>
+        <w:br/>
       </w:r>
     </w:p>
     <w:p>
       <w:pPr>
         <w:spacing w:after="160"/>
+        <w:ind w:left="-426"/>
       </w:pPr>
       <w:r>
         <w:rPr>
@@ -4868,19 +4811,11 @@
         </w:rPr>
         <w:t xml:space="preserve">Findings Summary: </w:t>
       </w:r>
-      <w:r>
-        <w:t>In the report, please write a list of findings from</w:t>
-      </w:r>
-      <w:r>
-        <w:t xml:space="preserve"> at least three</w:t>
-      </w:r>
-      <w:r>
-        <w:t xml:space="preserve"> experiments. For example, what was the effect of varying batch size, did higher learning rate hurt or improve performance, etc.</w:t>
-      </w:r>
     </w:p>
     <w:tbl>
       <w:tblPr>
-        <w:tblW w:w="9360" w:type="dxa"/>
+        <w:tblW w:w="10348" w:type="dxa"/>
+        <w:jc w:val="center"/>
         <w:tblBorders>
           <w:top w:val="single" w:sz="4" w:space="0" w:color="auto"/>
           <w:left w:val="single" w:sz="4" w:space="0" w:color="auto"/>
@@ -4896,14 +4831,18 @@
         <w:tblLook w:val="04A0" w:firstRow="1" w:lastRow="0" w:firstColumn="1" w:lastColumn="0" w:noHBand="0" w:noVBand="1"/>
       </w:tblPr>
       <w:tblGrid>
-        <w:gridCol w:w="2800"/>
-        <w:gridCol w:w="3000"/>
-        <w:gridCol w:w="3560"/>
+        <w:gridCol w:w="1701"/>
+        <w:gridCol w:w="4159"/>
+        <w:gridCol w:w="4488"/>
       </w:tblGrid>
       <w:tr>
+        <w:trPr>
+          <w:trHeight w:val="395"/>
+          <w:jc w:val="center"/>
+        </w:trPr>
         <w:tc>
           <w:tcPr>
-            <w:tcW w:w="2800" w:type="dxa"/>
+            <w:tcW w:w="1701" w:type="dxa"/>
             <w:tcBorders>
               <w:top w:val="single" w:sz="8" w:space="0" w:color="999999"/>
               <w:left w:val="single" w:sz="8" w:space="0" w:color="999999"/>
@@ -4935,7 +4874,7 @@
         </w:tc>
         <w:tc>
           <w:tcPr>
-            <w:tcW w:w="3000" w:type="dxa"/>
+            <w:tcW w:w="4159" w:type="dxa"/>
             <w:tcBorders>
               <w:top w:val="single" w:sz="8" w:space="0" w:color="999999"/>
               <w:left w:val="single" w:sz="8" w:space="0" w:color="999999"/>
@@ -4985,7 +4924,7 @@
         </w:tc>
         <w:tc>
           <w:tcPr>
-            <w:tcW w:w="3560" w:type="dxa"/>
+            <w:tcW w:w="4488" w:type="dxa"/>
             <w:tcBorders>
               <w:top w:val="single" w:sz="8" w:space="0" w:color="999999"/>
               <w:left w:val="single" w:sz="8" w:space="0" w:color="999999"/>
@@ -5017,9 +4956,13 @@
         </w:tc>
       </w:tr>
       <w:tr>
+        <w:trPr>
+          <w:trHeight w:val="1188"/>
+          <w:jc w:val="center"/>
+        </w:trPr>
         <w:tc>
           <w:tcPr>
-            <w:tcW w:w="2800" w:type="dxa"/>
+            <w:tcW w:w="1701" w:type="dxa"/>
             <w:tcBorders>
               <w:top w:val="single" w:sz="8" w:space="0" w:color="CCCCCC"/>
               <w:left w:val="single" w:sz="8" w:space="0" w:color="CCCCCC"/>
@@ -5035,7 +4978,7 @@
             </w:tcMar>
           </w:tcPr>
           <w:p>
-            <w:r>
+            <w:pPr>
               <w:rPr>
                 <w:i/>
                 <w:iCs/>
@@ -5043,8 +4986,7 @@
                 <w:sz w:val="20"/>
                 <w:szCs w:val="20"/>
               </w:rPr>
-              <w:t xml:space="preserve">e.g., </w:t>
-            </w:r>
+            </w:pPr>
             <w:r>
               <w:rPr>
                 <w:i/>
@@ -5053,8 +4995,10 @@
                 <w:sz w:val="20"/>
                 <w:szCs w:val="20"/>
               </w:rPr>
-              <w:t xml:space="preserve">Varied </w:t>
-            </w:r>
+              <w:t xml:space="preserve">Experiment 1 – </w:t>
+            </w:r>
+          </w:p>
+          <w:p>
             <w:r>
               <w:rPr>
                 <w:i/>
@@ -5063,13 +5007,13 @@
                 <w:sz w:val="20"/>
                 <w:szCs w:val="20"/>
               </w:rPr>
-              <w:t>Batch Size</w:t>
+              <w:t>Learning Rate Sensitivity</w:t>
             </w:r>
           </w:p>
         </w:tc>
         <w:tc>
           <w:tcPr>
-            <w:tcW w:w="3000" w:type="dxa"/>
+            <w:tcW w:w="4159" w:type="dxa"/>
             <w:tcBorders>
               <w:top w:val="single" w:sz="8" w:space="0" w:color="CCCCCC"/>
               <w:left w:val="single" w:sz="8" w:space="0" w:color="CCCCCC"/>
@@ -5093,7 +5037,7 @@
                 <w:sz w:val="20"/>
                 <w:szCs w:val="20"/>
               </w:rPr>
-              <w:t xml:space="preserve">e.g., 32 vs </w:t>
+              <w:t xml:space="preserve">LR = </w:t>
             </w:r>
             <w:r>
               <w:rPr>
@@ -5103,33 +5047,13 @@
                 <w:sz w:val="20"/>
                 <w:szCs w:val="20"/>
               </w:rPr>
-              <w:t xml:space="preserve">64 vs </w:t>
-            </w:r>
-            <w:r>
-              <w:rPr>
-                <w:i/>
-                <w:iCs/>
-                <w:color w:val="666666"/>
-                <w:sz w:val="20"/>
-                <w:szCs w:val="20"/>
-              </w:rPr>
-              <w:t>128</w:t>
-            </w:r>
-            <w:r>
-              <w:rPr>
-                <w:i/>
-                <w:iCs/>
-                <w:color w:val="666666"/>
-                <w:sz w:val="20"/>
-                <w:szCs w:val="20"/>
-              </w:rPr>
-              <w:t xml:space="preserve">  </w:t>
+              <w:t>0.0005 vs 0.0001 vs 0.00005</w:t>
             </w:r>
           </w:p>
         </w:tc>
         <w:tc>
           <w:tcPr>
-            <w:tcW w:w="3560" w:type="dxa"/>
+            <w:tcW w:w="4488" w:type="dxa"/>
             <w:tcBorders>
               <w:top w:val="single" w:sz="8" w:space="0" w:color="CCCCCC"/>
               <w:left w:val="single" w:sz="8" w:space="0" w:color="CCCCCC"/>
@@ -5153,15 +5077,19 @@
                 <w:sz w:val="20"/>
                 <w:szCs w:val="20"/>
               </w:rPr>
-              <w:t>Insert finding</w:t>
+              <w:t>Reducing the learning rate improved balanced performance. The best result was achieved with LR = 0.00005 (Val Accuracy = 0.7475, Val UAR = 0.7307), while a higher learning rate (0.0005) reduced both accuracy and UAR.</w:t>
             </w:r>
           </w:p>
         </w:tc>
       </w:tr>
       <w:tr>
+        <w:trPr>
+          <w:trHeight w:val="1188"/>
+          <w:jc w:val="center"/>
+        </w:trPr>
         <w:tc>
           <w:tcPr>
-            <w:tcW w:w="2800" w:type="dxa"/>
+            <w:tcW w:w="1701" w:type="dxa"/>
             <w:tcBorders>
               <w:top w:val="single" w:sz="8" w:space="0" w:color="CCCCCC"/>
               <w:left w:val="single" w:sz="8" w:space="0" w:color="CCCCCC"/>
@@ -5177,7 +5105,7 @@
             </w:tcMar>
           </w:tcPr>
           <w:p>
-            <w:r>
+            <w:pPr>
               <w:rPr>
                 <w:i/>
                 <w:iCs/>
@@ -5185,13 +5113,34 @@
                 <w:sz w:val="20"/>
                 <w:szCs w:val="20"/>
               </w:rPr>
-              <w:t>Experiment 2</w:t>
+            </w:pPr>
+            <w:r>
+              <w:rPr>
+                <w:i/>
+                <w:iCs/>
+                <w:color w:val="666666"/>
+                <w:sz w:val="20"/>
+                <w:szCs w:val="20"/>
+              </w:rPr>
+              <w:t xml:space="preserve">Experiment 2 – </w:t>
+            </w:r>
+          </w:p>
+          <w:p>
+            <w:r>
+              <w:rPr>
+                <w:i/>
+                <w:iCs/>
+                <w:color w:val="666666"/>
+                <w:sz w:val="20"/>
+                <w:szCs w:val="20"/>
+              </w:rPr>
+              <w:t>Architecture Comparison</w:t>
             </w:r>
           </w:p>
         </w:tc>
         <w:tc>
           <w:tcPr>
-            <w:tcW w:w="3000" w:type="dxa"/>
+            <w:tcW w:w="4159" w:type="dxa"/>
             <w:tcBorders>
               <w:top w:val="single" w:sz="8" w:space="0" w:color="CCCCCC"/>
               <w:left w:val="single" w:sz="8" w:space="0" w:color="CCCCCC"/>
@@ -5215,13 +5164,13 @@
                 <w:sz w:val="20"/>
                 <w:szCs w:val="20"/>
               </w:rPr>
-              <w:t>Hyperparameter</w:t>
+              <w:t>CustomCNN vs ResNet18 Enhanced (Fine-tuned) vs ResNet18 Enhanced (Frozen)</w:t>
             </w:r>
           </w:p>
         </w:tc>
         <w:tc>
           <w:tcPr>
-            <w:tcW w:w="3560" w:type="dxa"/>
+            <w:tcW w:w="4488" w:type="dxa"/>
             <w:tcBorders>
               <w:top w:val="single" w:sz="8" w:space="0" w:color="CCCCCC"/>
               <w:left w:val="single" w:sz="8" w:space="0" w:color="CCCCCC"/>
@@ -5245,15 +5194,19 @@
                 <w:sz w:val="20"/>
                 <w:szCs w:val="20"/>
               </w:rPr>
-              <w:t>Insert finding</w:t>
+              <w:t>Pretrained ResNet18 models substantially outperformed the CustomCNN. The CustomCNN achieved only 0.5125 accuracy and 0.3130 UAR, showing that transfer learning provided a major performance advantage.</w:t>
             </w:r>
           </w:p>
         </w:tc>
       </w:tr>
       <w:tr>
+        <w:trPr>
+          <w:trHeight w:val="1188"/>
+          <w:jc w:val="center"/>
+        </w:trPr>
         <w:tc>
           <w:tcPr>
-            <w:tcW w:w="2800" w:type="dxa"/>
+            <w:tcW w:w="1701" w:type="dxa"/>
             <w:tcBorders>
               <w:top w:val="single" w:sz="8" w:space="0" w:color="CCCCCC"/>
               <w:left w:val="single" w:sz="8" w:space="0" w:color="CCCCCC"/>
@@ -5269,7 +5222,7 @@
             </w:tcMar>
           </w:tcPr>
           <w:p>
-            <w:r>
+            <w:pPr>
               <w:rPr>
                 <w:i/>
                 <w:iCs/>
@@ -5277,13 +5230,44 @@
                 <w:sz w:val="20"/>
                 <w:szCs w:val="20"/>
               </w:rPr>
-              <w:t>Experiment 3</w:t>
+            </w:pPr>
+            <w:r>
+              <w:rPr>
+                <w:i/>
+                <w:iCs/>
+                <w:color w:val="666666"/>
+                <w:sz w:val="20"/>
+                <w:szCs w:val="20"/>
+              </w:rPr>
+              <w:t xml:space="preserve">Experiment 3 – </w:t>
+            </w:r>
+          </w:p>
+          <w:p>
+            <w:r>
+              <w:rPr>
+                <w:i/>
+                <w:iCs/>
+                <w:color w:val="666666"/>
+                <w:sz w:val="20"/>
+                <w:szCs w:val="20"/>
+              </w:rPr>
+              <w:t xml:space="preserve">Dropout </w:t>
+            </w:r>
+            <w:r>
+              <w:rPr>
+                <w:i/>
+                <w:iCs/>
+                <w:color w:val="666666"/>
+                <w:sz w:val="20"/>
+                <w:szCs w:val="20"/>
+              </w:rPr>
+              <w:t>Regularization</w:t>
             </w:r>
           </w:p>
         </w:tc>
         <w:tc>
           <w:tcPr>
-            <w:tcW w:w="3000" w:type="dxa"/>
+            <w:tcW w:w="4159" w:type="dxa"/>
             <w:tcBorders>
               <w:top w:val="single" w:sz="8" w:space="0" w:color="CCCCCC"/>
               <w:left w:val="single" w:sz="8" w:space="0" w:color="CCCCCC"/>
@@ -5307,13 +5291,13 @@
                 <w:sz w:val="20"/>
                 <w:szCs w:val="20"/>
               </w:rPr>
-              <w:t>Hyperparameter</w:t>
+              <w:t>Dropout = 0.2 vs 0.4 vs 0.6</w:t>
             </w:r>
           </w:p>
         </w:tc>
         <w:tc>
           <w:tcPr>
-            <w:tcW w:w="3560" w:type="dxa"/>
+            <w:tcW w:w="4488" w:type="dxa"/>
             <w:tcBorders>
               <w:top w:val="single" w:sz="8" w:space="0" w:color="CCCCCC"/>
               <w:left w:val="single" w:sz="8" w:space="0" w:color="CCCCCC"/>
@@ -5337,15 +5321,39 @@
                 <w:sz w:val="20"/>
                 <w:szCs w:val="20"/>
               </w:rPr>
-              <w:t>Insert finding</w:t>
+              <w:t xml:space="preserve">Dropout significantly affected </w:t>
+            </w:r>
+            <w:r>
+              <w:rPr>
+                <w:i/>
+                <w:iCs/>
+                <w:color w:val="666666"/>
+                <w:sz w:val="20"/>
+                <w:szCs w:val="20"/>
+              </w:rPr>
+              <w:t>generalization</w:t>
+            </w:r>
+            <w:r>
+              <w:rPr>
+                <w:i/>
+                <w:iCs/>
+                <w:color w:val="666666"/>
+                <w:sz w:val="20"/>
+                <w:szCs w:val="20"/>
+              </w:rPr>
+              <w:t>. Increasing dropout to 0.6 produced the highest UAR (0.7309), indicating improved balanced performance and better minority-class recognition.</w:t>
             </w:r>
           </w:p>
         </w:tc>
       </w:tr>
       <w:tr>
+        <w:trPr>
+          <w:trHeight w:val="696"/>
+          <w:jc w:val="center"/>
+        </w:trPr>
         <w:tc>
           <w:tcPr>
-            <w:tcW w:w="2800" w:type="dxa"/>
+            <w:tcW w:w="1701" w:type="dxa"/>
             <w:tcBorders>
               <w:top w:val="single" w:sz="8" w:space="0" w:color="CCCCCC"/>
               <w:left w:val="single" w:sz="8" w:space="0" w:color="CCCCCC"/>
@@ -5370,11 +5378,42 @@
                 <w:szCs w:val="20"/>
               </w:rPr>
             </w:pPr>
+            <w:r>
+              <w:rPr>
+                <w:i/>
+                <w:iCs/>
+                <w:color w:val="666666"/>
+                <w:sz w:val="20"/>
+                <w:szCs w:val="20"/>
+              </w:rPr>
+              <w:t xml:space="preserve">Experiment 4 – </w:t>
+            </w:r>
+          </w:p>
+          <w:p>
+            <w:pPr>
+              <w:rPr>
+                <w:i/>
+                <w:iCs/>
+                <w:color w:val="666666"/>
+                <w:sz w:val="20"/>
+                <w:szCs w:val="20"/>
+              </w:rPr>
+            </w:pPr>
+            <w:r>
+              <w:rPr>
+                <w:i/>
+                <w:iCs/>
+                <w:color w:val="666666"/>
+                <w:sz w:val="20"/>
+                <w:szCs w:val="20"/>
+              </w:rPr>
+              <w:t>Optimizer Comparison</w:t>
+            </w:r>
           </w:p>
         </w:tc>
         <w:tc>
           <w:tcPr>
-            <w:tcW w:w="3000" w:type="dxa"/>
+            <w:tcW w:w="4159" w:type="dxa"/>
             <w:tcBorders>
               <w:top w:val="single" w:sz="8" w:space="0" w:color="CCCCCC"/>
               <w:left w:val="single" w:sz="8" w:space="0" w:color="CCCCCC"/>
@@ -5399,11 +5438,31 @@
                 <w:szCs w:val="20"/>
               </w:rPr>
             </w:pPr>
+            <w:r>
+              <w:rPr>
+                <w:i/>
+                <w:iCs/>
+                <w:color w:val="666666"/>
+                <w:sz w:val="20"/>
+                <w:szCs w:val="20"/>
+              </w:rPr>
+              <w:t>Adam vs AdamW vs SGD (Momentum)</w:t>
+            </w:r>
+            <w:r>
+              <w:rPr>
+                <w:i/>
+                <w:iCs/>
+                <w:color w:val="666666"/>
+                <w:sz w:val="20"/>
+                <w:szCs w:val="20"/>
+              </w:rPr>
+              <w:t xml:space="preserve"> </w:t>
+            </w:r>
           </w:p>
         </w:tc>
         <w:tc>
           <w:tcPr>
-            <w:tcW w:w="3560" w:type="dxa"/>
+            <w:tcW w:w="4488" w:type="dxa"/>
             <w:tcBorders>
               <w:top w:val="single" w:sz="8" w:space="0" w:color="CCCCCC"/>
               <w:left w:val="single" w:sz="8" w:space="0" w:color="CCCCCC"/>
@@ -5428,33 +5487,53 @@
                 <w:szCs w:val="20"/>
               </w:rPr>
             </w:pPr>
+            <w:r>
+              <w:rPr>
+                <w:i/>
+                <w:iCs/>
+                <w:color w:val="666666"/>
+                <w:sz w:val="20"/>
+                <w:szCs w:val="20"/>
+              </w:rPr>
+              <w:t>Adam and AdamW produced similar results, while SGD performed very poorly (Val Accuracy = 0.1875, Val UAR = 0.2770). Adam remained the most reliable optimizer for this task.</w:t>
+            </w:r>
           </w:p>
         </w:tc>
       </w:tr>
     </w:tbl>
     <w:p>
       <w:pPr>
-        <w:spacing w:after="200"/>
-      </w:pPr>
-    </w:p>
-    <w:p>
-      <w:pPr>
         <w:spacing w:after="120"/>
+        <w:rPr>
+          <w:b/>
+          <w:bCs/>
+        </w:rPr>
       </w:pPr>
       <w:r>
         <w:rPr>
           <w:b/>
           <w:bCs/>
         </w:rPr>
-        <w:t xml:space="preserve">Conclusion: </w:t>
+        <w:br/>
       </w:r>
+    </w:p>
+    <w:p>
+      <w:pPr>
+        <w:spacing w:after="120"/>
+        <w:ind w:left="-426"/>
+      </w:pPr>
       <w:r>
-        <w:t>Finally, please comment on which experiment was the most impactful.</w:t>
+        <w:rPr>
+          <w:b/>
+          <w:bCs/>
+        </w:rPr>
+        <w:t>Conclusion:</w:t>
       </w:r>
     </w:p>
     <w:tbl>
       <w:tblPr>
-        <w:tblW w:w="9360" w:type="dxa"/>
+        <w:tblW w:w="10490" w:type="dxa"/>
+        <w:tblInd w:w="-577" w:type="dxa"/>
         <w:tblBorders>
           <w:top w:val="single" w:sz="4" w:space="0" w:color="auto"/>
           <w:left w:val="single" w:sz="4" w:space="0" w:color="auto"/>
@@ -5470,12 +5549,12 @@
         <w:tblLook w:val="04A0" w:firstRow="1" w:lastRow="0" w:firstColumn="1" w:lastColumn="0" w:noHBand="0" w:noVBand="1"/>
       </w:tblPr>
       <w:tblGrid>
-        <w:gridCol w:w="9360"/>
+        <w:gridCol w:w="10490"/>
       </w:tblGrid>
       <w:tr>
         <w:tc>
           <w:tcPr>
-            <w:tcW w:w="9360" w:type="dxa"/>
+            <w:tcW w:w="10490" w:type="dxa"/>
             <w:tcBorders>
               <w:top w:val="single" w:sz="8" w:space="0" w:color="CCCCCC"/>
               <w:left w:val="single" w:sz="8" w:space="0" w:color="CCCCCC"/>
@@ -5503,23 +5582,88 @@
             </w:r>
           </w:p>
           <w:p>
-            <w:r>
-              <w:rPr>
-                <w:i/>
-                <w:iCs/>
-                <w:color w:val="666666"/>
-              </w:rPr>
-              <w:t>Insert your answer here</w:t>
+            <w:pPr>
+              <w:rPr>
+                <w:i/>
+                <w:iCs/>
+                <w:color w:val="666666"/>
+              </w:rPr>
+            </w:pPr>
+            <w:r>
+              <w:rPr>
+                <w:b/>
+                <w:bCs/>
+                <w:i/>
+                <w:iCs/>
+                <w:color w:val="666666"/>
+              </w:rPr>
+              <w:t xml:space="preserve">The most impactful experiment was the Dropout </w:t>
+            </w:r>
+            <w:r>
+              <w:rPr>
+                <w:b/>
+                <w:bCs/>
+                <w:i/>
+                <w:iCs/>
+                <w:color w:val="666666"/>
+              </w:rPr>
+              <w:t>Regularization</w:t>
+            </w:r>
+            <w:r>
+              <w:rPr>
+                <w:b/>
+                <w:bCs/>
+                <w:i/>
+                <w:iCs/>
+                <w:color w:val="666666"/>
+              </w:rPr>
+              <w:t xml:space="preserve"> experiment.</w:t>
+            </w:r>
+            <w:r>
+              <w:rPr>
+                <w:i/>
+                <w:iCs/>
+                <w:color w:val="666666"/>
+              </w:rPr>
+              <w:t xml:space="preserve"> Adjusting the dropout rate produced the highest balanced performance, with dropout = 0.6 achieving the best UAR (0.7309) among all Task 1g runs. This experiment demonstrated that </w:t>
+            </w:r>
+            <w:r>
+              <w:rPr>
+                <w:i/>
+                <w:iCs/>
+                <w:color w:val="666666"/>
+              </w:rPr>
+              <w:t>regularization</w:t>
+            </w:r>
+            <w:r>
+              <w:rPr>
+                <w:i/>
+                <w:iCs/>
+                <w:color w:val="666666"/>
+              </w:rPr>
+              <w:t xml:space="preserve"> had a stronger effect on </w:t>
+            </w:r>
+            <w:r>
+              <w:rPr>
+                <w:i/>
+                <w:iCs/>
+                <w:color w:val="666666"/>
+              </w:rPr>
+              <w:t>generalization</w:t>
+            </w:r>
+            <w:r>
+              <w:rPr>
+                <w:i/>
+                <w:iCs/>
+                <w:color w:val="666666"/>
+              </w:rPr>
+              <w:t xml:space="preserve"> and minority-class recognition than changes to architecture or optimizer choice. Additionally, the learning rate experiment showed that a lower learning rate (0.00005) was critical for achieving the highest overall accuracy (0.7475) and strong balanced performance.</w:t>
             </w:r>
           </w:p>
         </w:tc>
       </w:tr>
     </w:tbl>
-    <w:p>
-      <w:pPr>
-        <w:spacing w:after="300"/>
-      </w:pPr>
-    </w:p>
+    <w:p/>
     <w:sectPr>
       <w:pgSz w:w="12240" w:h="15840"/>
       <w:pgMar w:top="1440" w:right="1440" w:bottom="1440" w:left="1440" w:header="708" w:footer="708" w:gutter="0"/>

</xml_diff>